<commit_message>
Sync IGCSE files from ~/Documents
</commit_message>
<xml_diff>
--- a/igcse things/IEL/Explorations/Year 10 - Unit 1 - Introduction to Global Perspectives/Lesson 1 - Intro to Global Perspectives/[CHAN (Isaac) Chun Shek] Year 10 Student Booklet Global Perspectives 2026_2027.docx
+++ b/igcse things/IEL/Explorations/Year 10 - Unit 1 - Introduction to Global Perspectives/Lesson 1 - Intro to Global Perspectives/[CHAN (Isaac) Chun Shek] Year 10 Student Booklet Global Perspectives 2026_2027.docx
@@ -2497,7 +2497,7 @@
                 <w:szCs w:val="24"/>
                 <w:rtl w:val="0"/>
               </w:rPr>
-              <w:t xml:space="preserve">Food and water is the most significant issue because they are requirements for human life and health.</w:t>
+              <w:t>Food and water security is the most significant issue because clean food and water are the basic requirements for human life - without them, no one can survive, let alone work, learn or improve their lives. It is also the issue that causes or worsens most of the others: a hungry population is more vulnerable to disease, more likely to turn to crime, and more likely to fight over scarce resources. Finally, it affects the most people - around 735 million people worldwide face hunger - making it both the most urgent and the most wide-reaching problem on the list.</w:t>
             </w:r>
           </w:p>
           <w:p>
@@ -4672,7 +4672,7 @@
           <w:bCs w:val="1"/>
           <w:rtl w:val="0"/>
         </w:rPr>
-        <w:t xml:space="preserve">On a local level, you can make a difference by making ocean-friendly choices when buying products or seafood, consuming only what you need, and actively reducing your use of single-use plastics.</w:t>
+        <w:t>In Hong Kong, local NGOs like Plastic Free Seas run regular beach clean-ups and school education programmes that stop plastic waste reaching the sea. Volunteers collect thousands of kilograms of rubbish from local beaches every year, and the education work teaches people to use less single-use plastic.</w:t>
       </w:r>
     </w:p>
     <w:p>
@@ -4706,7 +4706,7 @@
           <w:bCs w:val="1"/>
           <w:rtl w:val="0"/>
         </w:rPr>
-        <w:t xml:space="preserve">Establishing a legally backed, metric-driven framework that binds nations to target the root causes of ocean destruction</w:t>
+        <w:t>This helps because it tackles pollution at two points: the clean-ups remove plastic that is already in the ocean before it can be eaten by turtles and fish, and the school programmes stop plastic entering the sea in the first place. Less plastic in the water means fewer animals trapped or killed, and cleaner beaches for people too.</w:t>
       </w:r>
     </w:p>
     <w:p>
@@ -4756,15 +4756,7 @@
           <w:szCs w:val="24"/>
           <w:rtl w:val="0"/>
         </w:rPr>
-        <w:t xml:space="preserve">Governments</w:t>
-      </w:r>
-      <w:r>
-        <w:rPr>
-          <w:b w:val="1"/>
-          <w:bCs w:val="1"/>
-          <w:rtl w:val="0"/>
-        </w:rPr>
-        <w:t xml:space="preserve"> pass laws and ban plastic waste.</w:t>
+        <w:t>Governments - ban single-use plastics and enforce fishing laws; Businesses - redesign packaging so it is recyclable and stop using plastic straws and bags; NGOs - run clean-ups, monitor pollution and pressure governments; Individuals - refuse plastic bags and straws, join clean-ups and choose sustainable seafood.</w:t>
       </w:r>
     </w:p>
     <w:p>
@@ -5835,220 +5827,38 @@
             <w:vAlign w:val="top"/>
           </w:tcPr>
           <w:p>
-            <w:pPr>
-              <w:keepNext w:val="0"/>
-              <w:keepLines w:val="0"/>
-              <w:pageBreakBefore w:val="0"/>
-              <w:widowControl w:val="0"/>
-              <w:pBdr>
-                <w:top w:space="0" w:sz="0" w:val="nil"/>
-                <w:left w:space="0" w:sz="0" w:val="nil"/>
-                <w:bottom w:space="0" w:sz="0" w:val="nil"/>
-                <w:right w:space="0" w:sz="0" w:val="nil"/>
-                <w:between w:space="0" w:sz="0" w:val="nil"/>
-              </w:pBdr>
-              <w:shd w:fill="auto" w:val="clear"/>
-              <w:spacing w:after="0" w:before="0" w:line="240" w:lineRule="auto"/>
-              <w:ind w:left="0" w:right="0" w:firstLine="0"/>
-              <w:jc w:val="left"/>
-              <w:rPr>
-                <w:b w:val="1"/>
-                <w:bCs w:val="1"/>
-              </w:rPr>
-            </w:pPr>
-            <w:r>
-              <w:rPr>
-                <w:b w:val="1"/>
-                <w:bCs w:val="1"/>
-                <w:rtl w:val="0"/>
-              </w:rPr>
-              <w:t xml:space="preserve">Lack of funding</w:t>
-            </w:r>
-          </w:p>
-          <w:p>
-            <w:pPr>
-              <w:keepNext w:val="0"/>
-              <w:keepLines w:val="0"/>
-              <w:pageBreakBefore w:val="0"/>
-              <w:widowControl w:val="0"/>
-              <w:pBdr>
-                <w:top w:space="0" w:sz="0" w:val="nil"/>
-                <w:left w:space="0" w:sz="0" w:val="nil"/>
-                <w:bottom w:space="0" w:sz="0" w:val="nil"/>
-                <w:right w:space="0" w:sz="0" w:val="nil"/>
-                <w:between w:space="0" w:sz="0" w:val="nil"/>
-              </w:pBdr>
-              <w:shd w:fill="auto" w:val="clear"/>
-              <w:spacing w:after="0" w:before="0" w:line="240" w:lineRule="auto"/>
-              <w:ind w:left="0" w:right="0" w:firstLine="0"/>
-              <w:jc w:val="left"/>
-              <w:rPr>
-                <w:b w:val="1"/>
-                <w:bCs w:val="1"/>
-              </w:rPr>
-            </w:pPr>
-            <w:r>
-              <w:rPr>
-                <w:b w:val="1"/>
-                <w:bCs w:val="1"/>
-                <w:rtl w:val="0"/>
-              </w:rPr>
-              <w:t xml:space="preserve">Conflicts</w:t>
-            </w:r>
-          </w:p>
-          <w:p>
-            <w:pPr>
-              <w:keepNext w:val="0"/>
-              <w:keepLines w:val="0"/>
-              <w:pageBreakBefore w:val="0"/>
-              <w:widowControl w:val="0"/>
-              <w:pBdr>
-                <w:top w:space="0" w:sz="0" w:val="nil"/>
-                <w:left w:space="0" w:sz="0" w:val="nil"/>
-                <w:bottom w:space="0" w:sz="0" w:val="nil"/>
-                <w:right w:space="0" w:sz="0" w:val="nil"/>
-                <w:between w:space="0" w:sz="0" w:val="nil"/>
-              </w:pBdr>
-              <w:shd w:fill="auto" w:val="clear"/>
-              <w:spacing w:after="0" w:before="0" w:line="240" w:lineRule="auto"/>
-              <w:ind w:left="0" w:right="0" w:firstLine="0"/>
-              <w:jc w:val="left"/>
-              <w:rPr>
-                <w:b w:val="1"/>
-                <w:bCs w:val="1"/>
-              </w:rPr>
-            </w:pPr>
-            <w:r>
-              <w:rPr>
-                <w:b w:val="1"/>
-                <w:bCs w:val="1"/>
-                <w:rtl w:val="0"/>
-              </w:rPr>
-              <w:t xml:space="preserve">Inequality</w:t>
-            </w:r>
-          </w:p>
-          <w:p>
-            <w:pPr>
-              <w:keepNext w:val="0"/>
-              <w:keepLines w:val="0"/>
-              <w:pageBreakBefore w:val="0"/>
-              <w:widowControl w:val="0"/>
-              <w:pBdr>
-                <w:top w:space="0" w:sz="0" w:val="nil"/>
-                <w:left w:space="0" w:sz="0" w:val="nil"/>
-                <w:bottom w:space="0" w:sz="0" w:val="nil"/>
-                <w:right w:space="0" w:sz="0" w:val="nil"/>
-                <w:between w:space="0" w:sz="0" w:val="nil"/>
-              </w:pBdr>
-              <w:shd w:fill="auto" w:val="clear"/>
-              <w:spacing w:after="0" w:before="0" w:line="240" w:lineRule="auto"/>
-              <w:ind w:left="0" w:right="0" w:firstLine="0"/>
-              <w:jc w:val="left"/>
-              <w:rPr>
-                <w:b w:val="1"/>
-                <w:bCs w:val="1"/>
-              </w:rPr>
-            </w:pPr>
-            <w:r>
-              <w:rPr>
-                <w:b w:val="1"/>
-                <w:bCs w:val="1"/>
-                <w:rtl w:val="0"/>
-              </w:rPr>
-              <w:t xml:space="preserve">Runway pollution</w:t>
-            </w:r>
-          </w:p>
-          <w:p>
-            <w:pPr>
-              <w:keepNext w:val="0"/>
-              <w:keepLines w:val="0"/>
-              <w:pageBreakBefore w:val="0"/>
-              <w:widowControl w:val="0"/>
-              <w:pBdr>
-                <w:top w:space="0" w:sz="0" w:val="nil"/>
-                <w:left w:space="0" w:sz="0" w:val="nil"/>
-                <w:bottom w:space="0" w:sz="0" w:val="nil"/>
-                <w:right w:space="0" w:sz="0" w:val="nil"/>
-                <w:between w:space="0" w:sz="0" w:val="nil"/>
-              </w:pBdr>
-              <w:shd w:fill="auto" w:val="clear"/>
-              <w:spacing w:after="0" w:before="0" w:line="240" w:lineRule="auto"/>
-              <w:ind w:left="0" w:right="0" w:firstLine="0"/>
-              <w:jc w:val="left"/>
-              <w:rPr>
-                <w:b w:val="1"/>
-                <w:bCs w:val="1"/>
-              </w:rPr>
-            </w:pPr>
-            <w:r>
-              <w:rPr>
-                <w:b w:val="1"/>
-                <w:bCs w:val="1"/>
-                <w:rtl w:val="0"/>
-              </w:rPr>
-              <w:t xml:space="preserve">Overfishing</w:t>
-            </w:r>
-          </w:p>
-          <w:p>
-            <w:pPr>
-              <w:keepNext w:val="0"/>
-              <w:keepLines w:val="0"/>
-              <w:pageBreakBefore w:val="0"/>
-              <w:widowControl w:val="0"/>
-              <w:pBdr>
-                <w:top w:space="0" w:sz="0" w:val="nil"/>
-                <w:left w:space="0" w:sz="0" w:val="nil"/>
-                <w:bottom w:space="0" w:sz="0" w:val="nil"/>
-                <w:right w:space="0" w:sz="0" w:val="nil"/>
-                <w:between w:space="0" w:sz="0" w:val="nil"/>
-              </w:pBdr>
-              <w:shd w:fill="auto" w:val="clear"/>
-              <w:spacing w:after="0" w:before="0" w:line="240" w:lineRule="auto"/>
-              <w:ind w:left="0" w:right="0" w:firstLine="0"/>
-              <w:jc w:val="left"/>
-              <w:rPr>
-                <w:b w:val="1"/>
-                <w:bCs w:val="1"/>
-              </w:rPr>
-            </w:pPr>
-            <w:r>
-              <w:rPr>
-                <w:b w:val="1"/>
-                <w:bCs w:val="1"/>
-                <w:rtl w:val="0"/>
-              </w:rPr>
-              <w:t xml:space="preserve">Bycatch</w:t>
-            </w:r>
-          </w:p>
-          <w:p>
-            <w:pPr>
-              <w:keepNext w:val="0"/>
-              <w:keepLines w:val="0"/>
-              <w:pageBreakBefore w:val="0"/>
-              <w:widowControl w:val="0"/>
-              <w:pBdr>
-                <w:top w:space="0" w:sz="0" w:val="nil"/>
-                <w:left w:space="0" w:sz="0" w:val="nil"/>
-                <w:bottom w:space="0" w:sz="0" w:val="nil"/>
-                <w:right w:space="0" w:sz="0" w:val="nil"/>
-                <w:between w:space="0" w:sz="0" w:val="nil"/>
-              </w:pBdr>
-              <w:shd w:fill="auto" w:val="clear"/>
-              <w:spacing w:after="0" w:before="0" w:line="240" w:lineRule="auto"/>
-              <w:ind w:left="0" w:right="0" w:firstLine="0"/>
-              <w:jc w:val="left"/>
-              <w:rPr>
-                <w:b w:val="1"/>
-                <w:bCs w:val="1"/>
-              </w:rPr>
-            </w:pPr>
-            <w:r>
-              <w:rPr>
-                <w:b w:val="1"/>
-                <w:bCs w:val="1"/>
-                <w:rtl w:val="0"/>
-              </w:rPr>
-              <w:t xml:space="preserve">Single use plastic trap animals</w:t>
+            <w:r>
+              <w:t>Lack of funding - poor countries cannot afford waste treatment plants or patrol boats</w:t>
+            </w:r>
+          </w:p>
+          <w:p>
+            <w:r>
+              <w:t>Illegal and unregulated fishing - trawlers take fish faster than stocks can recover</w:t>
+            </w:r>
+          </w:p>
+          <w:p>
+            <w:r>
+              <w:t>Overfishing and bycatch - 33.1% of world fish stocks are overfished (FAO)</w:t>
+            </w:r>
+          </w:p>
+          <w:p>
+            <w:r>
+              <w:t>Plastic pollution - single-use plastics trap and kill marine animals</w:t>
+            </w:r>
+          </w:p>
+          <w:p>
+            <w:r>
+              <w:t>Rampant pollution - sewage, chemicals and microplastics flow into the sea</w:t>
+            </w:r>
+          </w:p>
+          <w:p>
+            <w:r>
+              <w:t>Climate change - warming and acidifying oceans destroy coral reefs</w:t>
+            </w:r>
+          </w:p>
+          <w:p>
+            <w:r>
+              <w:t>Weak laws and enforcement - countries struggle to police their own waters</w:t>
             </w:r>
           </w:p>
         </w:tc>
@@ -10063,7 +9873,12 @@
                 <w:u w:val="single"/>
                 <w:rtl w:val="0"/>
               </w:rPr>
-              <w:t xml:space="preserve">What's happening:</w:t>
+              <w:t>What's happening:</w:t>
+            </w:r>
+          </w:p>
+          <w:p>
+            <w:r>
+              <w:t>In a garment-factory town in Bangladesh (or a city like Nairobi), factories are installing automated cutting and sewing machines. Hundreds of machinists lose their jobs in one factory at a time, while young people queue for fewer openings or move into app-based (Uber/boda boda) work controlled by algorithms.</w:t>
             </w:r>
           </w:p>
         </w:tc>
@@ -10225,34 +10040,8 @@
             <w:vAlign w:val="top"/>
           </w:tcPr>
           <w:p>
-            <w:pPr>
-              <w:keepNext w:val="0"/>
-              <w:keepLines w:val="0"/>
-              <w:pageBreakBefore w:val="0"/>
-              <w:widowControl w:val="0"/>
-              <w:pBdr>
-                <w:top w:space="0" w:sz="0" w:val="nil"/>
-                <w:left w:space="0" w:sz="0" w:val="nil"/>
-                <w:bottom w:space="0" w:sz="0" w:val="nil"/>
-                <w:right w:space="0" w:sz="0" w:val="nil"/>
-                <w:between w:space="0" w:sz="0" w:val="nil"/>
-              </w:pBdr>
-              <w:shd w:fill="auto" w:val="clear"/>
-              <w:spacing w:after="0" w:before="0" w:line="240" w:lineRule="auto"/>
-              <w:ind w:left="0" w:right="0" w:firstLine="0"/>
-              <w:jc w:val="left"/>
-              <w:rPr>
-                <w:b w:val="1"/>
-                <w:bCs w:val="1"/>
-                <w:sz w:val="28"/>
-                <w:szCs w:val="28"/>
-                <w:u w:val="single"/>
-              </w:rPr>
-            </w:pPr>
-            <w:r>
-              <w:rPr>
-                <w:rtl w:val="0"/>
-              </w:rPr>
+            <w:r>
+              <w:t>Machines are cheaper, faster and never get tired, so factory owners automate to cut costs and win orders</w:t>
             </w:r>
           </w:p>
         </w:tc>
@@ -10268,34 +10057,8 @@
             <w:vAlign w:val="top"/>
           </w:tcPr>
           <w:p>
-            <w:pPr>
-              <w:keepNext w:val="0"/>
-              <w:keepLines w:val="0"/>
-              <w:pageBreakBefore w:val="0"/>
-              <w:widowControl w:val="0"/>
-              <w:pBdr>
-                <w:top w:space="0" w:sz="0" w:val="nil"/>
-                <w:left w:space="0" w:sz="0" w:val="nil"/>
-                <w:bottom w:space="0" w:sz="0" w:val="nil"/>
-                <w:right w:space="0" w:sz="0" w:val="nil"/>
-                <w:between w:space="0" w:sz="0" w:val="nil"/>
-              </w:pBdr>
-              <w:shd w:fill="auto" w:val="clear"/>
-              <w:spacing w:after="0" w:before="0" w:line="240" w:lineRule="auto"/>
-              <w:ind w:left="0" w:right="0" w:firstLine="0"/>
-              <w:jc w:val="left"/>
-              <w:rPr>
-                <w:b w:val="1"/>
-                <w:bCs w:val="1"/>
-                <w:sz w:val="28"/>
-                <w:szCs w:val="28"/>
-                <w:u w:val="single"/>
-              </w:rPr>
-            </w:pPr>
-            <w:r>
-              <w:rPr>
-                <w:rtl w:val="0"/>
-              </w:rPr>
+            <w:r>
+              <w:t>Local unemployment rises; families lose income; workers are pushed into informal/odd jobs with no security</w:t>
             </w:r>
           </w:p>
         </w:tc>
@@ -10317,34 +10080,8 @@
             <w:vAlign w:val="top"/>
           </w:tcPr>
           <w:p>
-            <w:pPr>
-              <w:keepNext w:val="0"/>
-              <w:keepLines w:val="0"/>
-              <w:pageBreakBefore w:val="0"/>
-              <w:widowControl w:val="0"/>
-              <w:pBdr>
-                <w:top w:space="0" w:sz="0" w:val="nil"/>
-                <w:left w:space="0" w:sz="0" w:val="nil"/>
-                <w:bottom w:space="0" w:sz="0" w:val="nil"/>
-                <w:right w:space="0" w:sz="0" w:val="nil"/>
-                <w:between w:space="0" w:sz="0" w:val="nil"/>
-              </w:pBdr>
-              <w:shd w:fill="auto" w:val="clear"/>
-              <w:spacing w:after="0" w:before="0" w:line="240" w:lineRule="auto"/>
-              <w:ind w:left="0" w:right="0" w:firstLine="0"/>
-              <w:jc w:val="left"/>
-              <w:rPr>
-                <w:b w:val="1"/>
-                <w:bCs w:val="1"/>
-                <w:sz w:val="28"/>
-                <w:szCs w:val="28"/>
-                <w:u w:val="single"/>
-              </w:rPr>
-            </w:pPr>
-            <w:r>
-              <w:rPr>
-                <w:rtl w:val="0"/>
-              </w:rPr>
+            <w:r>
+              <w:t>Global buyers demand lower prices, forcing factories to automate to compete</w:t>
             </w:r>
           </w:p>
         </w:tc>
@@ -10360,34 +10097,30 @@
             <w:vAlign w:val="top"/>
           </w:tcPr>
           <w:p>
-            <w:pPr>
-              <w:keepNext w:val="0"/>
-              <w:keepLines w:val="0"/>
-              <w:pageBreakBefore w:val="0"/>
-              <w:widowControl w:val="0"/>
-              <w:pBdr>
-                <w:top w:space="0" w:sz="0" w:val="nil"/>
-                <w:left w:space="0" w:sz="0" w:val="nil"/>
-                <w:bottom w:space="0" w:sz="0" w:val="nil"/>
-                <w:right w:space="0" w:sz="0" w:val="nil"/>
-                <w:between w:space="0" w:sz="0" w:val="nil"/>
-              </w:pBdr>
-              <w:shd w:fill="auto" w:val="clear"/>
-              <w:spacing w:after="0" w:before="0" w:line="240" w:lineRule="auto"/>
-              <w:ind w:left="0" w:right="0" w:firstLine="0"/>
-              <w:jc w:val="left"/>
-              <w:rPr>
-                <w:b w:val="1"/>
-                <w:bCs w:val="1"/>
-                <w:sz w:val="28"/>
-                <w:szCs w:val="28"/>
-                <w:u w:val="single"/>
-              </w:rPr>
-            </w:pPr>
-            <w:r>
-              <w:rPr>
-                <w:rtl w:val="0"/>
-              </w:rPr>
+            <w:r>
+              <w:t>Young people leave the town to find work, splitting up families (rural-urban migration)</w:t>
+            </w:r>
+          </w:p>
+        </w:tc>
+      </w:tr>
+      <w:tr>
+        <w:tc>
+          <w:tcPr>
+            <w:tcW w:type="dxa" w:w="4605"/>
+          </w:tcPr>
+          <w:p>
+            <w:r>
+              <w:t>Companies prefer machines because they do not go on strike or demand higher wages</w:t>
+            </w:r>
+          </w:p>
+        </w:tc>
+        <w:tc>
+          <w:tcPr>
+            <w:tcW w:type="dxa" w:w="4755"/>
+          </w:tcPr>
+          <w:p>
+            <w:r>
+              <w:t>Local workers without education or digital skills are left out of the new 'robot-friendly' jobs</w:t>
             </w:r>
           </w:p>
         </w:tc>
@@ -10507,7 +10240,12 @@
                 <w:u w:val="single"/>
                 <w:rtl w:val="0"/>
               </w:rPr>
-              <w:t xml:space="preserve">What's happening:</w:t>
+              <w:t>What's happening:</w:t>
+            </w:r>
+          </w:p>
+          <w:p>
+            <w:r>
+              <w:t>Across Kenya and Bangladesh, whole industries (garments, call centres, agriculture) are automating at once, while the government pushes new digital sectors - such as Kenya's M-Pesa and tech hubs - to replace the jobs lost.</w:t>
             </w:r>
           </w:p>
         </w:tc>
@@ -10669,34 +10407,8 @@
             <w:vAlign w:val="top"/>
           </w:tcPr>
           <w:p>
-            <w:pPr>
-              <w:keepNext w:val="0"/>
-              <w:keepLines w:val="0"/>
-              <w:pageBreakBefore w:val="0"/>
-              <w:widowControl w:val="0"/>
-              <w:pBdr>
-                <w:top w:space="0" w:sz="0" w:val="nil"/>
-                <w:left w:space="0" w:sz="0" w:val="nil"/>
-                <w:bottom w:space="0" w:sz="0" w:val="nil"/>
-                <w:right w:space="0" w:sz="0" w:val="nil"/>
-                <w:between w:space="0" w:sz="0" w:val="nil"/>
-              </w:pBdr>
-              <w:shd w:fill="auto" w:val="clear"/>
-              <w:spacing w:after="0" w:before="0" w:line="240" w:lineRule="auto"/>
-              <w:ind w:left="0" w:right="0" w:firstLine="0"/>
-              <w:jc w:val="left"/>
-              <w:rPr>
-                <w:b w:val="1"/>
-                <w:bCs w:val="1"/>
-                <w:sz w:val="28"/>
-                <w:szCs w:val="28"/>
-                <w:u w:val="single"/>
-              </w:rPr>
-            </w:pPr>
-            <w:r>
-              <w:rPr>
-                <w:rtl w:val="0"/>
-              </w:rPr>
+            <w:r>
+              <w:t>Falling robot prices worldwide make automation affordable even in lower-wage countries</w:t>
             </w:r>
           </w:p>
         </w:tc>
@@ -10712,34 +10424,8 @@
             <w:vAlign w:val="top"/>
           </w:tcPr>
           <w:p>
-            <w:pPr>
-              <w:keepNext w:val="0"/>
-              <w:keepLines w:val="0"/>
-              <w:pageBreakBefore w:val="0"/>
-              <w:widowControl w:val="0"/>
-              <w:pBdr>
-                <w:top w:space="0" w:sz="0" w:val="nil"/>
-                <w:left w:space="0" w:sz="0" w:val="nil"/>
-                <w:bottom w:space="0" w:sz="0" w:val="nil"/>
-                <w:right w:space="0" w:sz="0" w:val="nil"/>
-                <w:between w:space="0" w:sz="0" w:val="nil"/>
-              </w:pBdr>
-              <w:shd w:fill="auto" w:val="clear"/>
-              <w:spacing w:after="0" w:before="0" w:line="240" w:lineRule="auto"/>
-              <w:ind w:left="0" w:right="0" w:firstLine="0"/>
-              <w:jc w:val="left"/>
-              <w:rPr>
-                <w:b w:val="1"/>
-                <w:bCs w:val="1"/>
-                <w:sz w:val="28"/>
-                <w:szCs w:val="28"/>
-                <w:u w:val="single"/>
-              </w:rPr>
-            </w:pPr>
-            <w:r>
-              <w:rPr>
-                <w:rtl w:val="0"/>
-              </w:rPr>
+            <w:r>
+              <w:t>Formal (registered, secure) jobs shrink; inequality grows between skilled and unskilled workers</w:t>
             </w:r>
           </w:p>
         </w:tc>
@@ -10761,34 +10447,8 @@
             <w:vAlign w:val="top"/>
           </w:tcPr>
           <w:p>
-            <w:pPr>
-              <w:keepNext w:val="0"/>
-              <w:keepLines w:val="0"/>
-              <w:pageBreakBefore w:val="0"/>
-              <w:widowControl w:val="0"/>
-              <w:pBdr>
-                <w:top w:space="0" w:sz="0" w:val="nil"/>
-                <w:left w:space="0" w:sz="0" w:val="nil"/>
-                <w:bottom w:space="0" w:sz="0" w:val="nil"/>
-                <w:right w:space="0" w:sz="0" w:val="nil"/>
-                <w:between w:space="0" w:sz="0" w:val="nil"/>
-              </w:pBdr>
-              <w:shd w:fill="auto" w:val="clear"/>
-              <w:spacing w:after="0" w:before="0" w:line="240" w:lineRule="auto"/>
-              <w:ind w:left="0" w:right="0" w:firstLine="0"/>
-              <w:jc w:val="left"/>
-              <w:rPr>
-                <w:b w:val="1"/>
-                <w:bCs w:val="1"/>
-                <w:sz w:val="28"/>
-                <w:szCs w:val="28"/>
-                <w:u w:val="single"/>
-              </w:rPr>
-            </w:pPr>
-            <w:r>
-              <w:rPr>
-                <w:rtl w:val="0"/>
-              </w:rPr>
+            <w:r>
+              <w:t>Government policies attract foreign investment in modern factories</w:t>
             </w:r>
           </w:p>
         </w:tc>
@@ -10804,34 +10464,30 @@
             <w:vAlign w:val="top"/>
           </w:tcPr>
           <w:p>
-            <w:pPr>
-              <w:keepNext w:val="0"/>
-              <w:keepLines w:val="0"/>
-              <w:pageBreakBefore w:val="0"/>
-              <w:widowControl w:val="0"/>
-              <w:pBdr>
-                <w:top w:space="0" w:sz="0" w:val="nil"/>
-                <w:left w:space="0" w:sz="0" w:val="nil"/>
-                <w:bottom w:space="0" w:sz="0" w:val="nil"/>
-                <w:right w:space="0" w:sz="0" w:val="nil"/>
-                <w:between w:space="0" w:sz="0" w:val="nil"/>
-              </w:pBdr>
-              <w:shd w:fill="auto" w:val="clear"/>
-              <w:spacing w:after="0" w:before="0" w:line="240" w:lineRule="auto"/>
-              <w:ind w:left="0" w:right="0" w:firstLine="0"/>
-              <w:jc w:val="left"/>
-              <w:rPr>
-                <w:b w:val="1"/>
-                <w:bCs w:val="1"/>
-                <w:sz w:val="28"/>
-                <w:szCs w:val="28"/>
-                <w:u w:val="single"/>
-              </w:rPr>
-            </w:pPr>
-            <w:r>
-              <w:rPr>
-                <w:rtl w:val="0"/>
-              </w:rPr>
+            <w:r>
+              <w:t>Tax revenue falls as factory jobs disappear, hurting schools and hospitals</w:t>
+            </w:r>
+          </w:p>
+        </w:tc>
+      </w:tr>
+      <w:tr>
+        <w:tc>
+          <w:tcPr>
+            <w:tcW w:type="dxa" w:w="4680"/>
+          </w:tcPr>
+          <w:p>
+            <w:r>
+              <w:t>Cheap labour is no longer enough of a selling point - China and others already use robots</w:t>
+            </w:r>
+          </w:p>
+        </w:tc>
+        <w:tc>
+          <w:tcPr>
+            <w:tcW w:type="dxa" w:w="4680"/>
+          </w:tcPr>
+          <w:p>
+            <w:r>
+              <w:t>The country's 'cheap labour' advantage erodes; it must climb the value chain or stay poor</w:t>
             </w:r>
           </w:p>
         </w:tc>
@@ -10951,7 +10607,12 @@
                 <w:u w:val="single"/>
                 <w:rtl w:val="0"/>
               </w:rPr>
-              <w:t xml:space="preserve">What's happening</w:t>
+              <w:t>What's happening:</w:t>
+            </w:r>
+          </w:p>
+          <w:p>
+            <w:r>
+              <w:t>Oxford Economics estimates up to 20 million manufacturing jobs worldwide will be lost to robots by 2030, with a 'disproportionate toll on lower-skilled workers and on poorer local economies' - robot-related job losses hit poorer regions almost twice as hard.</w:t>
             </w:r>
           </w:p>
         </w:tc>
@@ -11121,34 +10782,8 @@
             <w:vAlign w:val="top"/>
           </w:tcPr>
           <w:p>
-            <w:pPr>
-              <w:keepNext w:val="0"/>
-              <w:keepLines w:val="0"/>
-              <w:pageBreakBefore w:val="0"/>
-              <w:widowControl w:val="0"/>
-              <w:pBdr>
-                <w:top w:space="0" w:sz="0" w:val="nil"/>
-                <w:left w:space="0" w:sz="0" w:val="nil"/>
-                <w:bottom w:space="0" w:sz="0" w:val="nil"/>
-                <w:right w:space="0" w:sz="0" w:val="nil"/>
-                <w:between w:space="0" w:sz="0" w:val="nil"/>
-              </w:pBdr>
-              <w:shd w:fill="auto" w:val="clear"/>
-              <w:spacing w:after="0" w:before="0" w:line="240" w:lineRule="auto"/>
-              <w:ind w:left="0" w:right="0" w:firstLine="0"/>
-              <w:jc w:val="left"/>
-              <w:rPr>
-                <w:b w:val="1"/>
-                <w:bCs w:val="1"/>
-                <w:sz w:val="28"/>
-                <w:szCs w:val="28"/>
-                <w:u w:val="single"/>
-              </w:rPr>
-            </w:pPr>
-            <w:r>
-              <w:rPr>
-                <w:rtl w:val="0"/>
-              </w:rPr>
+            <w:r>
+              <w:t>The 'Fourth Industrial Revolution' - AI and robotics advancing faster than ever (Oxford Economics, 2019)</w:t>
             </w:r>
           </w:p>
         </w:tc>
@@ -11164,34 +10799,8 @@
             <w:vAlign w:val="top"/>
           </w:tcPr>
           <w:p>
-            <w:pPr>
-              <w:keepNext w:val="0"/>
-              <w:keepLines w:val="0"/>
-              <w:pageBreakBefore w:val="0"/>
-              <w:widowControl w:val="0"/>
-              <w:pBdr>
-                <w:top w:space="0" w:sz="0" w:val="nil"/>
-                <w:left w:space="0" w:sz="0" w:val="nil"/>
-                <w:bottom w:space="0" w:sz="0" w:val="nil"/>
-                <w:right w:space="0" w:sz="0" w:val="nil"/>
-                <w:between w:space="0" w:sz="0" w:val="nil"/>
-              </w:pBdr>
-              <w:shd w:fill="auto" w:val="clear"/>
-              <w:spacing w:after="0" w:before="0" w:line="240" w:lineRule="auto"/>
-              <w:ind w:left="0" w:right="0" w:firstLine="0"/>
-              <w:jc w:val="left"/>
-              <w:rPr>
-                <w:b w:val="1"/>
-                <w:bCs w:val="1"/>
-                <w:sz w:val="28"/>
-                <w:szCs w:val="28"/>
-                <w:u w:val="single"/>
-              </w:rPr>
-            </w:pPr>
-            <w:r>
-              <w:rPr>
-                <w:rtl w:val="0"/>
-              </w:rPr>
+            <w:r>
+              <w:t>Global inequality widens: rich countries gain the productivity, poor countries lose the jobs</w:t>
             </w:r>
           </w:p>
         </w:tc>
@@ -11213,34 +10822,8 @@
             <w:vAlign w:val="top"/>
           </w:tcPr>
           <w:p>
-            <w:pPr>
-              <w:keepNext w:val="0"/>
-              <w:keepLines w:val="0"/>
-              <w:pageBreakBefore w:val="0"/>
-              <w:widowControl w:val="0"/>
-              <w:pBdr>
-                <w:top w:space="0" w:sz="0" w:val="nil"/>
-                <w:left w:space="0" w:sz="0" w:val="nil"/>
-                <w:bottom w:space="0" w:sz="0" w:val="nil"/>
-                <w:right w:space="0" w:sz="0" w:val="nil"/>
-                <w:between w:space="0" w:sz="0" w:val="nil"/>
-              </w:pBdr>
-              <w:shd w:fill="auto" w:val="clear"/>
-              <w:spacing w:after="0" w:before="0" w:line="240" w:lineRule="auto"/>
-              <w:ind w:left="0" w:right="0" w:firstLine="0"/>
-              <w:jc w:val="left"/>
-              <w:rPr>
-                <w:b w:val="1"/>
-                <w:bCs w:val="1"/>
-                <w:sz w:val="28"/>
-                <w:szCs w:val="28"/>
-                <w:u w:val="single"/>
-              </w:rPr>
-            </w:pPr>
-            <w:r>
-              <w:rPr>
-                <w:rtl w:val="0"/>
-              </w:rPr>
+            <w:r>
+              <w:t>Global competition forces every country to automate or lose orders</w:t>
             </w:r>
           </w:p>
         </w:tc>
@@ -11256,34 +10839,30 @@
             <w:vAlign w:val="top"/>
           </w:tcPr>
           <w:p>
-            <w:pPr>
-              <w:keepNext w:val="0"/>
-              <w:keepLines w:val="0"/>
-              <w:pageBreakBefore w:val="0"/>
-              <w:widowControl w:val="0"/>
-              <w:pBdr>
-                <w:top w:space="0" w:sz="0" w:val="nil"/>
-                <w:left w:space="0" w:sz="0" w:val="nil"/>
-                <w:bottom w:space="0" w:sz="0" w:val="nil"/>
-                <w:right w:space="0" w:sz="0" w:val="nil"/>
-                <w:between w:space="0" w:sz="0" w:val="nil"/>
-              </w:pBdr>
-              <w:shd w:fill="auto" w:val="clear"/>
-              <w:spacing w:after="0" w:before="0" w:line="240" w:lineRule="auto"/>
-              <w:ind w:left="0" w:right="0" w:firstLine="0"/>
-              <w:jc w:val="left"/>
-              <w:rPr>
-                <w:b w:val="1"/>
-                <w:bCs w:val="1"/>
-                <w:sz w:val="28"/>
-                <w:szCs w:val="28"/>
-                <w:u w:val="single"/>
-              </w:rPr>
-            </w:pPr>
-            <w:r>
-              <w:rPr>
-                <w:rtl w:val="0"/>
-              </w:rPr>
+            <w:r>
+              <w:t>The cheap-labour path that lifted China and East Asia out of poverty is closing for today's poor countries</w:t>
+            </w:r>
+          </w:p>
+        </w:tc>
+      </w:tr>
+      <w:tr>
+        <w:tc>
+          <w:tcPr>
+            <w:tcW w:type="dxa" w:w="4680"/>
+          </w:tcPr>
+          <w:p>
+            <w:r>
+              <w:t>COVID-19 pushed companies to automate even faster</w:t>
+            </w:r>
+          </w:p>
+        </w:tc>
+        <w:tc>
+          <w:tcPr>
+            <w:tcW w:type="dxa" w:w="4680"/>
+          </w:tcPr>
+          <w:p>
+            <w:r>
+              <w:t>Migration pressure grows as workers leave countries with no jobs</w:t>
             </w:r>
           </w:p>
         </w:tc>
@@ -11789,213 +11368,8 @@
             <w:vAlign w:val="top"/>
           </w:tcPr>
           <w:p>
-            <w:pPr>
-              <w:keepNext w:val="0"/>
-              <w:keepLines w:val="0"/>
-              <w:pageBreakBefore w:val="0"/>
-              <w:widowControl w:val="0"/>
-              <w:pBdr>
-                <w:top w:space="0" w:sz="0" w:val="nil"/>
-                <w:left w:space="0" w:sz="0" w:val="nil"/>
-                <w:bottom w:space="0" w:sz="0" w:val="nil"/>
-                <w:right w:space="0" w:sz="0" w:val="nil"/>
-                <w:between w:space="0" w:sz="0" w:val="nil"/>
-              </w:pBdr>
-              <w:shd w:fill="auto" w:val="clear"/>
-              <w:spacing w:after="0" w:before="0" w:line="240" w:lineRule="auto"/>
-              <w:ind w:left="0" w:right="0" w:firstLine="0"/>
-              <w:jc w:val="left"/>
-              <w:rPr>
-                <w:b w:val="1"/>
-                <w:bCs w:val="1"/>
-                <w:sz w:val="28"/>
-                <w:szCs w:val="28"/>
-              </w:rPr>
-            </w:pPr>
-            <w:r>
-              <w:rPr>
-                <w:rtl w:val="0"/>
-              </w:rPr>
-            </w:r>
-          </w:p>
-          <w:p>
-            <w:pPr>
-              <w:keepNext w:val="0"/>
-              <w:keepLines w:val="0"/>
-              <w:pageBreakBefore w:val="0"/>
-              <w:widowControl w:val="0"/>
-              <w:pBdr>
-                <w:top w:space="0" w:sz="0" w:val="nil"/>
-                <w:left w:space="0" w:sz="0" w:val="nil"/>
-                <w:bottom w:space="0" w:sz="0" w:val="nil"/>
-                <w:right w:space="0" w:sz="0" w:val="nil"/>
-                <w:between w:space="0" w:sz="0" w:val="nil"/>
-              </w:pBdr>
-              <w:shd w:fill="auto" w:val="clear"/>
-              <w:spacing w:after="0" w:before="0" w:line="240" w:lineRule="auto"/>
-              <w:ind w:left="0" w:right="0" w:firstLine="0"/>
-              <w:jc w:val="left"/>
-              <w:rPr>
-                <w:b w:val="1"/>
-                <w:bCs w:val="1"/>
-                <w:sz w:val="28"/>
-                <w:szCs w:val="28"/>
-              </w:rPr>
-            </w:pPr>
-            <w:r>
-              <w:rPr>
-                <w:rtl w:val="0"/>
-              </w:rPr>
-            </w:r>
-          </w:p>
-          <w:p>
-            <w:pPr>
-              <w:keepNext w:val="0"/>
-              <w:keepLines w:val="0"/>
-              <w:pageBreakBefore w:val="0"/>
-              <w:widowControl w:val="0"/>
-              <w:pBdr>
-                <w:top w:space="0" w:sz="0" w:val="nil"/>
-                <w:left w:space="0" w:sz="0" w:val="nil"/>
-                <w:bottom w:space="0" w:sz="0" w:val="nil"/>
-                <w:right w:space="0" w:sz="0" w:val="nil"/>
-                <w:between w:space="0" w:sz="0" w:val="nil"/>
-              </w:pBdr>
-              <w:shd w:fill="auto" w:val="clear"/>
-              <w:spacing w:after="0" w:before="0" w:line="240" w:lineRule="auto"/>
-              <w:ind w:left="0" w:right="0" w:firstLine="0"/>
-              <w:jc w:val="left"/>
-              <w:rPr>
-                <w:b w:val="1"/>
-                <w:bCs w:val="1"/>
-                <w:sz w:val="28"/>
-                <w:szCs w:val="28"/>
-              </w:rPr>
-            </w:pPr>
-            <w:r>
-              <w:rPr>
-                <w:rtl w:val="0"/>
-              </w:rPr>
-            </w:r>
-          </w:p>
-          <w:p>
-            <w:pPr>
-              <w:keepNext w:val="0"/>
-              <w:keepLines w:val="0"/>
-              <w:pageBreakBefore w:val="0"/>
-              <w:widowControl w:val="0"/>
-              <w:pBdr>
-                <w:top w:space="0" w:sz="0" w:val="nil"/>
-                <w:left w:space="0" w:sz="0" w:val="nil"/>
-                <w:bottom w:space="0" w:sz="0" w:val="nil"/>
-                <w:right w:space="0" w:sz="0" w:val="nil"/>
-                <w:between w:space="0" w:sz="0" w:val="nil"/>
-              </w:pBdr>
-              <w:shd w:fill="auto" w:val="clear"/>
-              <w:spacing w:after="0" w:before="0" w:line="240" w:lineRule="auto"/>
-              <w:ind w:left="0" w:right="0" w:firstLine="0"/>
-              <w:jc w:val="left"/>
-              <w:rPr>
-                <w:b w:val="1"/>
-                <w:bCs w:val="1"/>
-                <w:sz w:val="28"/>
-                <w:szCs w:val="28"/>
-              </w:rPr>
-            </w:pPr>
-            <w:r>
-              <w:rPr>
-                <w:rtl w:val="0"/>
-              </w:rPr>
-            </w:r>
-          </w:p>
-          <w:p>
-            <w:pPr>
-              <w:keepNext w:val="0"/>
-              <w:keepLines w:val="0"/>
-              <w:pageBreakBefore w:val="0"/>
-              <w:widowControl w:val="0"/>
-              <w:pBdr>
-                <w:top w:space="0" w:sz="0" w:val="nil"/>
-                <w:left w:space="0" w:sz="0" w:val="nil"/>
-                <w:bottom w:space="0" w:sz="0" w:val="nil"/>
-                <w:right w:space="0" w:sz="0" w:val="nil"/>
-                <w:between w:space="0" w:sz="0" w:val="nil"/>
-              </w:pBdr>
-              <w:shd w:fill="auto" w:val="clear"/>
-              <w:spacing w:after="0" w:before="0" w:line="240" w:lineRule="auto"/>
-              <w:ind w:left="0" w:right="0" w:firstLine="0"/>
-              <w:jc w:val="left"/>
-              <w:rPr>
-                <w:b w:val="1"/>
-                <w:bCs w:val="1"/>
-                <w:sz w:val="28"/>
-                <w:szCs w:val="28"/>
-              </w:rPr>
-            </w:pPr>
-            <w:r>
-              <w:rPr>
-                <w:rtl w:val="0"/>
-              </w:rPr>
-            </w:r>
-          </w:p>
-          <w:p>
-            <w:pPr>
-              <w:keepNext w:val="0"/>
-              <w:keepLines w:val="0"/>
-              <w:pageBreakBefore w:val="0"/>
-              <w:widowControl w:val="0"/>
-              <w:pBdr>
-                <w:top w:space="0" w:sz="0" w:val="nil"/>
-                <w:left w:space="0" w:sz="0" w:val="nil"/>
-                <w:bottom w:space="0" w:sz="0" w:val="nil"/>
-                <w:right w:space="0" w:sz="0" w:val="nil"/>
-                <w:between w:space="0" w:sz="0" w:val="nil"/>
-              </w:pBdr>
-              <w:shd w:fill="auto" w:val="clear"/>
-              <w:spacing w:after="0" w:before="0" w:line="240" w:lineRule="auto"/>
-              <w:ind w:left="0" w:right="0" w:firstLine="0"/>
-              <w:jc w:val="left"/>
-              <w:rPr>
-                <w:b w:val="1"/>
-                <w:bCs w:val="1"/>
-                <w:sz w:val="28"/>
-                <w:szCs w:val="28"/>
-              </w:rPr>
-            </w:pPr>
-            <w:r>
-              <w:rPr>
-                <w:rtl w:val="0"/>
-              </w:rPr>
-            </w:r>
-          </w:p>
-          <w:p>
-            <w:pPr>
-              <w:keepNext w:val="0"/>
-              <w:keepLines w:val="0"/>
-              <w:pageBreakBefore w:val="0"/>
-              <w:widowControl w:val="0"/>
-              <w:pBdr>
-                <w:top w:space="0" w:sz="0" w:val="nil"/>
-                <w:left w:space="0" w:sz="0" w:val="nil"/>
-                <w:bottom w:space="0" w:sz="0" w:val="nil"/>
-                <w:right w:space="0" w:sz="0" w:val="nil"/>
-                <w:between w:space="0" w:sz="0" w:val="nil"/>
-              </w:pBdr>
-              <w:shd w:fill="auto" w:val="clear"/>
-              <w:spacing w:after="0" w:before="0" w:line="240" w:lineRule="auto"/>
-              <w:ind w:left="0" w:right="0" w:firstLine="0"/>
-              <w:jc w:val="left"/>
-              <w:rPr>
-                <w:b w:val="1"/>
-                <w:bCs w:val="1"/>
-                <w:sz w:val="28"/>
-                <w:szCs w:val="28"/>
-              </w:rPr>
-            </w:pPr>
-            <w:r>
-              <w:rPr>
-                <w:rtl w:val="0"/>
-              </w:rPr>
+            <w:r>
+              <w:t>The falling cost of automation combined with global competition - because it forces poorer countries to automate whether they are ready or not, so it drives every other cause.</w:t>
             </w:r>
           </w:p>
         </w:tc>
@@ -12011,33 +11385,8 @@
             <w:vAlign w:val="top"/>
           </w:tcPr>
           <w:p>
-            <w:pPr>
-              <w:keepNext w:val="0"/>
-              <w:keepLines w:val="0"/>
-              <w:pageBreakBefore w:val="0"/>
-              <w:widowControl w:val="0"/>
-              <w:pBdr>
-                <w:top w:space="0" w:sz="0" w:val="nil"/>
-                <w:left w:space="0" w:sz="0" w:val="nil"/>
-                <w:bottom w:space="0" w:sz="0" w:val="nil"/>
-                <w:right w:space="0" w:sz="0" w:val="nil"/>
-                <w:between w:space="0" w:sz="0" w:val="nil"/>
-              </w:pBdr>
-              <w:shd w:fill="auto" w:val="clear"/>
-              <w:spacing w:after="0" w:before="0" w:line="240" w:lineRule="auto"/>
-              <w:ind w:left="0" w:right="0" w:firstLine="0"/>
-              <w:jc w:val="left"/>
-              <w:rPr>
-                <w:b w:val="1"/>
-                <w:bCs w:val="1"/>
-                <w:sz w:val="28"/>
-                <w:szCs w:val="28"/>
-              </w:rPr>
-            </w:pPr>
-            <w:r>
-              <w:rPr>
-                <w:rtl w:val="0"/>
-              </w:rPr>
+            <w:r>
+              <w:t>Losing the cheap-labour 'ladder' to development - because it was how billions of people escaped poverty (China, Vietnam, Bangladesh), and no country has found a replacement path yet.</w:t>
             </w:r>
           </w:p>
         </w:tc>
@@ -12764,33 +12113,8 @@
             <w:vAlign w:val="top"/>
           </w:tcPr>
           <w:p>
-            <w:pPr>
-              <w:keepNext w:val="0"/>
-              <w:keepLines w:val="0"/>
-              <w:pageBreakBefore w:val="0"/>
-              <w:widowControl w:val="0"/>
-              <w:pBdr>
-                <w:top w:space="0" w:sz="0" w:val="nil"/>
-                <w:left w:space="0" w:sz="0" w:val="nil"/>
-                <w:bottom w:space="0" w:sz="0" w:val="nil"/>
-                <w:right w:space="0" w:sz="0" w:val="nil"/>
-                <w:between w:space="0" w:sz="0" w:val="nil"/>
-              </w:pBdr>
-              <w:shd w:fill="auto" w:val="clear"/>
-              <w:spacing w:after="0" w:before="0" w:line="240" w:lineRule="auto"/>
-              <w:ind w:left="0" w:right="0" w:firstLine="0"/>
-              <w:jc w:val="left"/>
-              <w:rPr>
-                <w:b w:val="1"/>
-                <w:bCs w:val="1"/>
-                <w:sz w:val="28"/>
-                <w:szCs w:val="28"/>
-              </w:rPr>
-            </w:pPr>
-            <w:r>
-              <w:rPr>
-                <w:rtl w:val="0"/>
-              </w:rPr>
+            <w:r>
+              <w:t>Education / ability - A university graduate sees automation as an opportunity (new tech jobs, higher pay), while a primary-school-educated garment worker sees the same machines as the end of their livelihood. Education changes whether you fear or benefit from technology.</w:t>
             </w:r>
           </w:p>
         </w:tc>
@@ -12812,33 +12136,8 @@
             <w:vAlign w:val="top"/>
           </w:tcPr>
           <w:p>
-            <w:pPr>
-              <w:keepNext w:val="0"/>
-              <w:keepLines w:val="0"/>
-              <w:pageBreakBefore w:val="0"/>
-              <w:widowControl w:val="0"/>
-              <w:pBdr>
-                <w:top w:space="0" w:sz="0" w:val="nil"/>
-                <w:left w:space="0" w:sz="0" w:val="nil"/>
-                <w:bottom w:space="0" w:sz="0" w:val="nil"/>
-                <w:right w:space="0" w:sz="0" w:val="nil"/>
-                <w:between w:space="0" w:sz="0" w:val="nil"/>
-              </w:pBdr>
-              <w:shd w:fill="auto" w:val="clear"/>
-              <w:spacing w:after="0" w:before="0" w:line="240" w:lineRule="auto"/>
-              <w:ind w:left="0" w:right="0" w:firstLine="0"/>
-              <w:jc w:val="left"/>
-              <w:rPr>
-                <w:b w:val="1"/>
-                <w:bCs w:val="1"/>
-                <w:sz w:val="28"/>
-                <w:szCs w:val="28"/>
-              </w:rPr>
-            </w:pPr>
-            <w:r>
-              <w:rPr>
-                <w:rtl w:val="0"/>
-              </w:rPr>
+            <w:r>
+              <w:t>Age - A 16-year-old has grown up with phones and AI and expects to learn new skills easily, so they are more optimistic. A 55-year-old factory worker who cannot easily retrain faces losing their only skill, so they see automation as a threat.</w:t>
             </w:r>
           </w:p>
         </w:tc>
@@ -12860,33 +12159,8 @@
             <w:vAlign w:val="top"/>
           </w:tcPr>
           <w:p>
-            <w:pPr>
-              <w:keepNext w:val="0"/>
-              <w:keepLines w:val="0"/>
-              <w:pageBreakBefore w:val="0"/>
-              <w:widowControl w:val="0"/>
-              <w:pBdr>
-                <w:top w:space="0" w:sz="0" w:val="nil"/>
-                <w:left w:space="0" w:sz="0" w:val="nil"/>
-                <w:bottom w:space="0" w:sz="0" w:val="nil"/>
-                <w:right w:space="0" w:sz="0" w:val="nil"/>
-                <w:between w:space="0" w:sz="0" w:val="nil"/>
-              </w:pBdr>
-              <w:shd w:fill="auto" w:val="clear"/>
-              <w:spacing w:after="0" w:before="0" w:line="240" w:lineRule="auto"/>
-              <w:ind w:left="0" w:right="0" w:firstLine="0"/>
-              <w:jc w:val="left"/>
-              <w:rPr>
-                <w:b w:val="1"/>
-                <w:bCs w:val="1"/>
-                <w:sz w:val="28"/>
-                <w:szCs w:val="28"/>
-              </w:rPr>
-            </w:pPr>
-            <w:r>
-              <w:rPr>
-                <w:rtl w:val="0"/>
-              </w:rPr>
+            <w:r>
+              <w:t>Nationality / level of development - A Bangladeshi garment worker in a low-wage economy faces immediate job loss with no safety net, while a worker in wealthier Singapore has government retraining schemes and savings - so the same issue looks like a crisis to one and a change to the other.</w:t>
             </w:r>
           </w:p>
         </w:tc>
@@ -13898,59 +13172,8 @@
             <w:vAlign w:val="top"/>
           </w:tcPr>
           <w:p>
-            <w:pPr>
-              <w:keepNext w:val="0"/>
-              <w:keepLines w:val="0"/>
-              <w:pageBreakBefore w:val="0"/>
-              <w:widowControl w:val="0"/>
-              <w:pBdr>
-                <w:top w:space="0" w:sz="0" w:val="nil"/>
-                <w:left w:space="0" w:sz="0" w:val="nil"/>
-                <w:bottom w:space="0" w:sz="0" w:val="nil"/>
-                <w:right w:space="0" w:sz="0" w:val="nil"/>
-                <w:between w:space="0" w:sz="0" w:val="nil"/>
-              </w:pBdr>
-              <w:shd w:fill="auto" w:val="clear"/>
-              <w:spacing w:after="0" w:before="0" w:line="240" w:lineRule="auto"/>
-              <w:ind w:left="0" w:right="0" w:firstLine="0"/>
-              <w:jc w:val="left"/>
-              <w:rPr>
-                <w:b w:val="1"/>
-                <w:bCs w:val="1"/>
-              </w:rPr>
-            </w:pPr>
-            <w:r>
-              <w:rPr>
-                <w:rtl w:val="0"/>
-              </w:rPr>
-            </w:r>
-          </w:p>
-          <w:p>
-            <w:pPr>
-              <w:keepNext w:val="0"/>
-              <w:keepLines w:val="0"/>
-              <w:pageBreakBefore w:val="0"/>
-              <w:widowControl w:val="0"/>
-              <w:pBdr>
-                <w:top w:space="0" w:sz="0" w:val="nil"/>
-                <w:left w:space="0" w:sz="0" w:val="nil"/>
-                <w:bottom w:space="0" w:sz="0" w:val="nil"/>
-                <w:right w:space="0" w:sz="0" w:val="nil"/>
-                <w:between w:space="0" w:sz="0" w:val="nil"/>
-              </w:pBdr>
-              <w:shd w:fill="auto" w:val="clear"/>
-              <w:spacing w:after="0" w:before="0" w:line="240" w:lineRule="auto"/>
-              <w:ind w:left="0" w:right="0" w:firstLine="0"/>
-              <w:jc w:val="left"/>
-              <w:rPr>
-                <w:b w:val="1"/>
-                <w:bCs w:val="1"/>
-              </w:rPr>
-            </w:pPr>
-            <w:r>
-              <w:rPr>
-                <w:rtl w:val="0"/>
-              </w:rPr>
+            <w:r>
+              <w:t>My education and age shape my view most. As a student in an international school with good access to technology, I am being educated to work with computers, not against them - so automation feels like an opportunity to me personally. I recognise this is a privileged position: if I had grown up in a poorer country with less schooling, the same machines would probably look like a threat instead. That is why I think we need to protect the people who are not as lucky as me.</w:t>
             </w:r>
           </w:p>
         </w:tc>
@@ -14451,165 +13674,8 @@
             <w:vAlign w:val="top"/>
           </w:tcPr>
           <w:p>
-            <w:pPr>
-              <w:pageBreakBefore w:val="0"/>
-              <w:widowControl w:val="0"/>
-              <w:spacing w:line="240" w:lineRule="auto"/>
-              <w:rPr>
-                <w:b w:val="1"/>
-                <w:bCs w:val="1"/>
-                <w:sz w:val="28"/>
-                <w:szCs w:val="28"/>
-              </w:rPr>
-            </w:pPr>
-            <w:r>
-              <w:rPr>
-                <w:rtl w:val="0"/>
-              </w:rPr>
-            </w:r>
-          </w:p>
-          <w:p>
-            <w:pPr>
-              <w:pageBreakBefore w:val="0"/>
-              <w:widowControl w:val="0"/>
-              <w:spacing w:line="240" w:lineRule="auto"/>
-              <w:rPr>
-                <w:b w:val="1"/>
-                <w:bCs w:val="1"/>
-                <w:sz w:val="28"/>
-                <w:szCs w:val="28"/>
-              </w:rPr>
-            </w:pPr>
-            <w:r>
-              <w:rPr>
-                <w:rtl w:val="0"/>
-              </w:rPr>
-            </w:r>
-          </w:p>
-          <w:p>
-            <w:pPr>
-              <w:pageBreakBefore w:val="0"/>
-              <w:widowControl w:val="0"/>
-              <w:spacing w:line="240" w:lineRule="auto"/>
-              <w:rPr>
-                <w:b w:val="1"/>
-                <w:bCs w:val="1"/>
-                <w:sz w:val="28"/>
-                <w:szCs w:val="28"/>
-              </w:rPr>
-            </w:pPr>
-            <w:r>
-              <w:rPr>
-                <w:rtl w:val="0"/>
-              </w:rPr>
-            </w:r>
-          </w:p>
-          <w:p>
-            <w:pPr>
-              <w:pageBreakBefore w:val="0"/>
-              <w:widowControl w:val="0"/>
-              <w:spacing w:line="240" w:lineRule="auto"/>
-              <w:rPr>
-                <w:b w:val="1"/>
-                <w:bCs w:val="1"/>
-                <w:sz w:val="28"/>
-                <w:szCs w:val="28"/>
-              </w:rPr>
-            </w:pPr>
-            <w:r>
-              <w:rPr>
-                <w:rtl w:val="0"/>
-              </w:rPr>
-            </w:r>
-          </w:p>
-          <w:p>
-            <w:pPr>
-              <w:pageBreakBefore w:val="0"/>
-              <w:widowControl w:val="0"/>
-              <w:spacing w:line="240" w:lineRule="auto"/>
-              <w:rPr>
-                <w:b w:val="1"/>
-                <w:bCs w:val="1"/>
-                <w:sz w:val="28"/>
-                <w:szCs w:val="28"/>
-              </w:rPr>
-            </w:pPr>
-            <w:r>
-              <w:rPr>
-                <w:rtl w:val="0"/>
-              </w:rPr>
-            </w:r>
-          </w:p>
-          <w:p>
-            <w:pPr>
-              <w:pageBreakBefore w:val="0"/>
-              <w:widowControl w:val="0"/>
-              <w:spacing w:line="240" w:lineRule="auto"/>
-              <w:rPr>
-                <w:b w:val="1"/>
-                <w:bCs w:val="1"/>
-                <w:sz w:val="28"/>
-                <w:szCs w:val="28"/>
-              </w:rPr>
-            </w:pPr>
-            <w:r>
-              <w:rPr>
-                <w:rtl w:val="0"/>
-              </w:rPr>
-            </w:r>
-          </w:p>
-          <w:p>
-            <w:pPr>
-              <w:pageBreakBefore w:val="0"/>
-              <w:widowControl w:val="0"/>
-              <w:spacing w:line="240" w:lineRule="auto"/>
-              <w:rPr>
-                <w:b w:val="1"/>
-                <w:bCs w:val="1"/>
-                <w:sz w:val="28"/>
-                <w:szCs w:val="28"/>
-              </w:rPr>
-            </w:pPr>
-            <w:r>
-              <w:rPr>
-                <w:rtl w:val="0"/>
-              </w:rPr>
-            </w:r>
-          </w:p>
-          <w:p>
-            <w:pPr>
-              <w:pageBreakBefore w:val="0"/>
-              <w:widowControl w:val="0"/>
-              <w:spacing w:line="240" w:lineRule="auto"/>
-              <w:rPr>
-                <w:b w:val="1"/>
-                <w:bCs w:val="1"/>
-                <w:sz w:val="28"/>
-                <w:szCs w:val="28"/>
-              </w:rPr>
-            </w:pPr>
-            <w:r>
-              <w:rPr>
-                <w:rtl w:val="0"/>
-              </w:rPr>
-            </w:r>
-          </w:p>
-          <w:p>
-            <w:pPr>
-              <w:pageBreakBefore w:val="0"/>
-              <w:widowControl w:val="0"/>
-              <w:spacing w:line="240" w:lineRule="auto"/>
-              <w:rPr>
-                <w:b w:val="1"/>
-                <w:bCs w:val="1"/>
-                <w:sz w:val="28"/>
-                <w:szCs w:val="28"/>
-              </w:rPr>
-            </w:pPr>
-            <w:r>
-              <w:rPr>
-                <w:rtl w:val="0"/>
-              </w:rPr>
+            <w:r>
+              <w:t>Bill Gates - co-founder of Microsoft and philanthropist (add a photo of him here)</w:t>
             </w:r>
           </w:p>
         </w:tc>
@@ -14625,21 +13691,8 @@
             <w:vAlign w:val="top"/>
           </w:tcPr>
           <w:p>
-            <w:pPr>
-              <w:pageBreakBefore w:val="0"/>
-              <w:widowControl w:val="0"/>
-              <w:spacing w:line="240" w:lineRule="auto"/>
-              <w:rPr>
-                <w:b w:val="1"/>
-                <w:bCs w:val="1"/>
-                <w:sz w:val="28"/>
-                <w:szCs w:val="28"/>
-              </w:rPr>
-            </w:pPr>
-            <w:r>
-              <w:rPr>
-                <w:rtl w:val="0"/>
-              </w:rPr>
+            <w:r>
+              <w:t>Automation is replacing people faster than society is ready for, and the change hurts society unless governments act. He argues we should slow it down and use the money to help people retrain - for example through a 'robot tax'.</w:t>
             </w:r>
           </w:p>
         </w:tc>
@@ -14655,21 +13708,8 @@
             <w:vAlign w:val="top"/>
           </w:tcPr>
           <w:p>
-            <w:pPr>
-              <w:pageBreakBefore w:val="0"/>
-              <w:widowControl w:val="0"/>
-              <w:spacing w:line="240" w:lineRule="auto"/>
-              <w:rPr>
-                <w:b w:val="1"/>
-                <w:bCs w:val="1"/>
-                <w:sz w:val="28"/>
-                <w:szCs w:val="28"/>
-              </w:rPr>
-            </w:pPr>
-            <w:r>
-              <w:rPr>
-                <w:rtl w:val="0"/>
-              </w:rPr>
+            <w:r>
+              <w:t>"You ought to tax the robot at a level that's slow enough that it's equal to the tax of a human doing that job." (Interview with Quartz, February 2017)</w:t>
             </w:r>
           </w:p>
         </w:tc>
@@ -14685,21 +13725,8 @@
             <w:vAlign w:val="top"/>
           </w:tcPr>
           <w:p>
-            <w:pPr>
-              <w:pageBreakBefore w:val="0"/>
-              <w:widowControl w:val="0"/>
-              <w:spacing w:line="240" w:lineRule="auto"/>
-              <w:rPr>
-                <w:b w:val="1"/>
-                <w:bCs w:val="1"/>
-                <w:sz w:val="28"/>
-                <w:szCs w:val="28"/>
-              </w:rPr>
-            </w:pPr>
-            <w:r>
-              <w:rPr>
-                <w:rtl w:val="0"/>
-              </w:rPr>
+            <w:r>
+              <w:t>As a tech founder he knows exactly how powerful automation is; he believes its gains must be shared and displaced workers cushioned.</w:t>
             </w:r>
           </w:p>
         </w:tc>
@@ -14721,165 +13748,8 @@
             <w:vAlign w:val="top"/>
           </w:tcPr>
           <w:p>
-            <w:pPr>
-              <w:pageBreakBefore w:val="0"/>
-              <w:widowControl w:val="0"/>
-              <w:spacing w:line="240" w:lineRule="auto"/>
-              <w:rPr>
-                <w:b w:val="1"/>
-                <w:bCs w:val="1"/>
-                <w:sz w:val="28"/>
-                <w:szCs w:val="28"/>
-              </w:rPr>
-            </w:pPr>
-            <w:r>
-              <w:rPr>
-                <w:rtl w:val="0"/>
-              </w:rPr>
-            </w:r>
-          </w:p>
-          <w:p>
-            <w:pPr>
-              <w:pageBreakBefore w:val="0"/>
-              <w:widowControl w:val="0"/>
-              <w:spacing w:line="240" w:lineRule="auto"/>
-              <w:rPr>
-                <w:b w:val="1"/>
-                <w:bCs w:val="1"/>
-                <w:sz w:val="28"/>
-                <w:szCs w:val="28"/>
-              </w:rPr>
-            </w:pPr>
-            <w:r>
-              <w:rPr>
-                <w:rtl w:val="0"/>
-              </w:rPr>
-            </w:r>
-          </w:p>
-          <w:p>
-            <w:pPr>
-              <w:pageBreakBefore w:val="0"/>
-              <w:widowControl w:val="0"/>
-              <w:spacing w:line="240" w:lineRule="auto"/>
-              <w:rPr>
-                <w:b w:val="1"/>
-                <w:bCs w:val="1"/>
-                <w:sz w:val="28"/>
-                <w:szCs w:val="28"/>
-              </w:rPr>
-            </w:pPr>
-            <w:r>
-              <w:rPr>
-                <w:rtl w:val="0"/>
-              </w:rPr>
-            </w:r>
-          </w:p>
-          <w:p>
-            <w:pPr>
-              <w:pageBreakBefore w:val="0"/>
-              <w:widowControl w:val="0"/>
-              <w:spacing w:line="240" w:lineRule="auto"/>
-              <w:rPr>
-                <w:b w:val="1"/>
-                <w:bCs w:val="1"/>
-                <w:sz w:val="28"/>
-                <w:szCs w:val="28"/>
-              </w:rPr>
-            </w:pPr>
-            <w:r>
-              <w:rPr>
-                <w:rtl w:val="0"/>
-              </w:rPr>
-            </w:r>
-          </w:p>
-          <w:p>
-            <w:pPr>
-              <w:pageBreakBefore w:val="0"/>
-              <w:widowControl w:val="0"/>
-              <w:spacing w:line="240" w:lineRule="auto"/>
-              <w:rPr>
-                <w:b w:val="1"/>
-                <w:bCs w:val="1"/>
-                <w:sz w:val="28"/>
-                <w:szCs w:val="28"/>
-              </w:rPr>
-            </w:pPr>
-            <w:r>
-              <w:rPr>
-                <w:rtl w:val="0"/>
-              </w:rPr>
-            </w:r>
-          </w:p>
-          <w:p>
-            <w:pPr>
-              <w:pageBreakBefore w:val="0"/>
-              <w:widowControl w:val="0"/>
-              <w:spacing w:line="240" w:lineRule="auto"/>
-              <w:rPr>
-                <w:b w:val="1"/>
-                <w:bCs w:val="1"/>
-                <w:sz w:val="28"/>
-                <w:szCs w:val="28"/>
-              </w:rPr>
-            </w:pPr>
-            <w:r>
-              <w:rPr>
-                <w:rtl w:val="0"/>
-              </w:rPr>
-            </w:r>
-          </w:p>
-          <w:p>
-            <w:pPr>
-              <w:pageBreakBefore w:val="0"/>
-              <w:widowControl w:val="0"/>
-              <w:spacing w:line="240" w:lineRule="auto"/>
-              <w:rPr>
-                <w:b w:val="1"/>
-                <w:bCs w:val="1"/>
-                <w:sz w:val="28"/>
-                <w:szCs w:val="28"/>
-              </w:rPr>
-            </w:pPr>
-            <w:r>
-              <w:rPr>
-                <w:rtl w:val="0"/>
-              </w:rPr>
-            </w:r>
-          </w:p>
-          <w:p>
-            <w:pPr>
-              <w:pageBreakBefore w:val="0"/>
-              <w:widowControl w:val="0"/>
-              <w:spacing w:line="240" w:lineRule="auto"/>
-              <w:rPr>
-                <w:b w:val="1"/>
-                <w:bCs w:val="1"/>
-                <w:sz w:val="28"/>
-                <w:szCs w:val="28"/>
-              </w:rPr>
-            </w:pPr>
-            <w:r>
-              <w:rPr>
-                <w:rtl w:val="0"/>
-              </w:rPr>
-            </w:r>
-          </w:p>
-          <w:p>
-            <w:pPr>
-              <w:pageBreakBefore w:val="0"/>
-              <w:widowControl w:val="0"/>
-              <w:spacing w:line="240" w:lineRule="auto"/>
-              <w:rPr>
-                <w:b w:val="1"/>
-                <w:bCs w:val="1"/>
-                <w:sz w:val="28"/>
-                <w:szCs w:val="28"/>
-              </w:rPr>
-            </w:pPr>
-            <w:r>
-              <w:rPr>
-                <w:rtl w:val="0"/>
-              </w:rPr>
+            <w:r>
+              <w:t>Jack Ma - founder of Alibaba, China's e-commerce giant (add a photo of him here)</w:t>
             </w:r>
           </w:p>
         </w:tc>
@@ -14895,21 +13765,8 @@
             <w:vAlign w:val="top"/>
           </w:tcPr>
           <w:p>
-            <w:pPr>
-              <w:pageBreakBefore w:val="0"/>
-              <w:widowControl w:val="0"/>
-              <w:spacing w:line="240" w:lineRule="auto"/>
-              <w:rPr>
-                <w:b w:val="1"/>
-                <w:bCs w:val="1"/>
-                <w:sz w:val="28"/>
-                <w:szCs w:val="28"/>
-              </w:rPr>
-            </w:pPr>
-            <w:r>
-              <w:rPr>
-                <w:rtl w:val="0"/>
-              </w:rPr>
+            <w:r>
+              <w:t>AI and robotics will bring serious 'pain' and job losses in the coming decades - especially to unprepared countries - but the answer is NOT to stop technology; humans should focus on what machines cannot do, and governments must invest in education so people can adapt.</w:t>
             </w:r>
           </w:p>
         </w:tc>
@@ -14925,21 +13782,8 @@
             <w:vAlign w:val="top"/>
           </w:tcPr>
           <w:p>
-            <w:pPr>
-              <w:pageBreakBefore w:val="0"/>
-              <w:widowControl w:val="0"/>
-              <w:spacing w:line="240" w:lineRule="auto"/>
-              <w:rPr>
-                <w:b w:val="1"/>
-                <w:bCs w:val="1"/>
-                <w:sz w:val="28"/>
-                <w:szCs w:val="28"/>
-              </w:rPr>
-            </w:pPr>
-            <w:r>
-              <w:rPr>
-                <w:rtl w:val="0"/>
-              </w:rPr>
+            <w:r>
+              <w:t>"In the next 30 years, the world will see much more pain than happiness." and "Machines should only do what humans cannot do." (public speeches, 2017)</w:t>
             </w:r>
           </w:p>
         </w:tc>
@@ -14955,26 +13799,18 @@
             <w:vAlign w:val="top"/>
           </w:tcPr>
           <w:p>
-            <w:pPr>
-              <w:pageBreakBefore w:val="0"/>
-              <w:widowControl w:val="0"/>
-              <w:spacing w:line="240" w:lineRule="auto"/>
-              <w:rPr>
-                <w:b w:val="1"/>
-                <w:bCs w:val="1"/>
-                <w:sz w:val="28"/>
-                <w:szCs w:val="28"/>
-              </w:rPr>
-            </w:pPr>
-            <w:r>
-              <w:rPr>
-                <w:rtl w:val="0"/>
-              </w:rPr>
+            <w:r>
+              <w:t>He built his business in a developing country and knows poor countries must move up the value chain; he believes human creativity is the one thing machines cannot replace, so education is the only real protection.</w:t>
             </w:r>
           </w:p>
         </w:tc>
       </w:tr>
     </w:tbl>
+    <w:p>
+      <w:r>
+        <w:t>Most convincing argument: Bill Gates - because his argument is evidence-based and offers a solution: the data (Oxford Economics: 20 million manufacturing jobs lost by 2030, poorer regions hit twice as hard) supports his concern, and the 'robot tax' gives governments something concrete to do. Jack Ma's argument is persuasive but is more about his personal belief that humans will adapt, which is a hope rather than a plan.</w:t>
+      </w:r>
+    </w:p>
     <w:p>
       <w:pPr>
         <w:pageBreakBefore w:val="0"/>
@@ -15626,278 +14462,18 @@
             <w:vAlign w:val="top"/>
           </w:tcPr>
           <w:p>
-            <w:pPr>
-              <w:keepNext w:val="0"/>
-              <w:keepLines w:val="0"/>
-              <w:pageBreakBefore w:val="0"/>
-              <w:widowControl w:val="0"/>
-              <w:pBdr>
-                <w:top w:space="0" w:sz="0" w:val="nil"/>
-                <w:left w:space="0" w:sz="0" w:val="nil"/>
-                <w:bottom w:space="0" w:sz="0" w:val="nil"/>
-                <w:right w:space="0" w:sz="0" w:val="nil"/>
-                <w:between w:space="0" w:sz="0" w:val="nil"/>
-              </w:pBdr>
-              <w:shd w:fill="auto" w:val="clear"/>
-              <w:spacing w:after="0" w:before="0" w:line="240" w:lineRule="auto"/>
-              <w:ind w:left="0" w:right="0" w:firstLine="0"/>
-              <w:jc w:val="left"/>
-              <w:rPr/>
-            </w:pPr>
-            <w:r>
-              <w:rPr>
-                <w:rtl w:val="0"/>
-              </w:rPr>
-            </w:r>
-          </w:p>
-          <w:p>
-            <w:pPr>
-              <w:keepNext w:val="0"/>
-              <w:keepLines w:val="0"/>
-              <w:pageBreakBefore w:val="0"/>
-              <w:widowControl w:val="0"/>
-              <w:pBdr>
-                <w:top w:space="0" w:sz="0" w:val="nil"/>
-                <w:left w:space="0" w:sz="0" w:val="nil"/>
-                <w:bottom w:space="0" w:sz="0" w:val="nil"/>
-                <w:right w:space="0" w:sz="0" w:val="nil"/>
-                <w:between w:space="0" w:sz="0" w:val="nil"/>
-              </w:pBdr>
-              <w:shd w:fill="auto" w:val="clear"/>
-              <w:spacing w:after="0" w:before="0" w:line="240" w:lineRule="auto"/>
-              <w:ind w:left="0" w:right="0" w:firstLine="0"/>
-              <w:jc w:val="left"/>
-              <w:rPr/>
-            </w:pPr>
-            <w:r>
-              <w:rPr>
-                <w:rtl w:val="0"/>
-              </w:rPr>
-            </w:r>
-          </w:p>
-          <w:p>
-            <w:pPr>
-              <w:keepNext w:val="0"/>
-              <w:keepLines w:val="0"/>
-              <w:pageBreakBefore w:val="0"/>
-              <w:widowControl w:val="0"/>
-              <w:pBdr>
-                <w:top w:space="0" w:sz="0" w:val="nil"/>
-                <w:left w:space="0" w:sz="0" w:val="nil"/>
-                <w:bottom w:space="0" w:sz="0" w:val="nil"/>
-                <w:right w:space="0" w:sz="0" w:val="nil"/>
-                <w:between w:space="0" w:sz="0" w:val="nil"/>
-              </w:pBdr>
-              <w:shd w:fill="auto" w:val="clear"/>
-              <w:spacing w:after="0" w:before="0" w:line="240" w:lineRule="auto"/>
-              <w:ind w:left="0" w:right="0" w:firstLine="0"/>
-              <w:jc w:val="left"/>
-              <w:rPr/>
-            </w:pPr>
-            <w:r>
-              <w:rPr>
-                <w:rtl w:val="0"/>
-              </w:rPr>
-            </w:r>
-          </w:p>
-          <w:p>
-            <w:pPr>
-              <w:keepNext w:val="0"/>
-              <w:keepLines w:val="0"/>
-              <w:pageBreakBefore w:val="0"/>
-              <w:widowControl w:val="0"/>
-              <w:pBdr>
-                <w:top w:space="0" w:sz="0" w:val="nil"/>
-                <w:left w:space="0" w:sz="0" w:val="nil"/>
-                <w:bottom w:space="0" w:sz="0" w:val="nil"/>
-                <w:right w:space="0" w:sz="0" w:val="nil"/>
-                <w:between w:space="0" w:sz="0" w:val="nil"/>
-              </w:pBdr>
-              <w:shd w:fill="auto" w:val="clear"/>
-              <w:spacing w:after="0" w:before="0" w:line="240" w:lineRule="auto"/>
-              <w:ind w:left="0" w:right="0" w:firstLine="0"/>
-              <w:jc w:val="left"/>
-              <w:rPr/>
-            </w:pPr>
-            <w:r>
-              <w:rPr>
-                <w:rtl w:val="0"/>
-              </w:rPr>
-            </w:r>
-          </w:p>
-          <w:p>
-            <w:pPr>
-              <w:keepNext w:val="0"/>
-              <w:keepLines w:val="0"/>
-              <w:pageBreakBefore w:val="0"/>
-              <w:widowControl w:val="0"/>
-              <w:pBdr>
-                <w:top w:space="0" w:sz="0" w:val="nil"/>
-                <w:left w:space="0" w:sz="0" w:val="nil"/>
-                <w:bottom w:space="0" w:sz="0" w:val="nil"/>
-                <w:right w:space="0" w:sz="0" w:val="nil"/>
-                <w:between w:space="0" w:sz="0" w:val="nil"/>
-              </w:pBdr>
-              <w:shd w:fill="auto" w:val="clear"/>
-              <w:spacing w:after="0" w:before="0" w:line="240" w:lineRule="auto"/>
-              <w:ind w:left="0" w:right="0" w:firstLine="0"/>
-              <w:jc w:val="left"/>
-              <w:rPr/>
-            </w:pPr>
-            <w:r>
-              <w:rPr>
-                <w:rtl w:val="0"/>
-              </w:rPr>
-            </w:r>
-          </w:p>
-          <w:p>
-            <w:pPr>
-              <w:keepNext w:val="0"/>
-              <w:keepLines w:val="0"/>
-              <w:pageBreakBefore w:val="0"/>
-              <w:widowControl w:val="0"/>
-              <w:pBdr>
-                <w:top w:space="0" w:sz="0" w:val="nil"/>
-                <w:left w:space="0" w:sz="0" w:val="nil"/>
-                <w:bottom w:space="0" w:sz="0" w:val="nil"/>
-                <w:right w:space="0" w:sz="0" w:val="nil"/>
-                <w:between w:space="0" w:sz="0" w:val="nil"/>
-              </w:pBdr>
-              <w:shd w:fill="auto" w:val="clear"/>
-              <w:spacing w:after="0" w:before="0" w:line="240" w:lineRule="auto"/>
-              <w:ind w:left="0" w:right="0" w:firstLine="0"/>
-              <w:jc w:val="left"/>
-              <w:rPr/>
-            </w:pPr>
-            <w:r>
-              <w:rPr>
-                <w:rtl w:val="0"/>
-              </w:rPr>
-            </w:r>
-          </w:p>
-          <w:p>
-            <w:pPr>
-              <w:keepNext w:val="0"/>
-              <w:keepLines w:val="0"/>
-              <w:pageBreakBefore w:val="0"/>
-              <w:widowControl w:val="0"/>
-              <w:pBdr>
-                <w:top w:space="0" w:sz="0" w:val="nil"/>
-                <w:left w:space="0" w:sz="0" w:val="nil"/>
-                <w:bottom w:space="0" w:sz="0" w:val="nil"/>
-                <w:right w:space="0" w:sz="0" w:val="nil"/>
-                <w:between w:space="0" w:sz="0" w:val="nil"/>
-              </w:pBdr>
-              <w:shd w:fill="auto" w:val="clear"/>
-              <w:spacing w:after="0" w:before="0" w:line="240" w:lineRule="auto"/>
-              <w:ind w:left="0" w:right="0" w:firstLine="0"/>
-              <w:jc w:val="left"/>
-              <w:rPr/>
-            </w:pPr>
-            <w:r>
-              <w:rPr>
-                <w:rtl w:val="0"/>
-              </w:rPr>
-            </w:r>
-          </w:p>
-          <w:p>
-            <w:pPr>
-              <w:keepNext w:val="0"/>
-              <w:keepLines w:val="0"/>
-              <w:pageBreakBefore w:val="0"/>
-              <w:widowControl w:val="0"/>
-              <w:pBdr>
-                <w:top w:space="0" w:sz="0" w:val="nil"/>
-                <w:left w:space="0" w:sz="0" w:val="nil"/>
-                <w:bottom w:space="0" w:sz="0" w:val="nil"/>
-                <w:right w:space="0" w:sz="0" w:val="nil"/>
-                <w:between w:space="0" w:sz="0" w:val="nil"/>
-              </w:pBdr>
-              <w:shd w:fill="auto" w:val="clear"/>
-              <w:spacing w:after="0" w:before="0" w:line="240" w:lineRule="auto"/>
-              <w:ind w:left="0" w:right="0" w:firstLine="0"/>
-              <w:jc w:val="left"/>
-              <w:rPr/>
-            </w:pPr>
-            <w:r>
-              <w:rPr>
-                <w:rtl w:val="0"/>
-              </w:rPr>
-            </w:r>
-          </w:p>
-          <w:p>
-            <w:pPr>
-              <w:keepNext w:val="0"/>
-              <w:keepLines w:val="0"/>
-              <w:pageBreakBefore w:val="0"/>
-              <w:widowControl w:val="0"/>
-              <w:pBdr>
-                <w:top w:space="0" w:sz="0" w:val="nil"/>
-                <w:left w:space="0" w:sz="0" w:val="nil"/>
-                <w:bottom w:space="0" w:sz="0" w:val="nil"/>
-                <w:right w:space="0" w:sz="0" w:val="nil"/>
-                <w:between w:space="0" w:sz="0" w:val="nil"/>
-              </w:pBdr>
-              <w:shd w:fill="auto" w:val="clear"/>
-              <w:spacing w:after="0" w:before="0" w:line="240" w:lineRule="auto"/>
-              <w:ind w:left="0" w:right="0" w:firstLine="0"/>
-              <w:jc w:val="left"/>
-              <w:rPr/>
-            </w:pPr>
-            <w:r>
-              <w:rPr>
-                <w:rtl w:val="0"/>
-              </w:rPr>
-            </w:r>
-          </w:p>
-          <w:p>
-            <w:pPr>
-              <w:keepNext w:val="0"/>
-              <w:keepLines w:val="0"/>
-              <w:pageBreakBefore w:val="0"/>
-              <w:widowControl w:val="0"/>
-              <w:pBdr>
-                <w:top w:space="0" w:sz="0" w:val="nil"/>
-                <w:left w:space="0" w:sz="0" w:val="nil"/>
-                <w:bottom w:space="0" w:sz="0" w:val="nil"/>
-                <w:right w:space="0" w:sz="0" w:val="nil"/>
-                <w:between w:space="0" w:sz="0" w:val="nil"/>
-              </w:pBdr>
-              <w:shd w:fill="auto" w:val="clear"/>
-              <w:spacing w:after="0" w:before="0" w:line="240" w:lineRule="auto"/>
-              <w:ind w:left="0" w:right="0" w:firstLine="0"/>
-              <w:jc w:val="left"/>
-              <w:rPr/>
-            </w:pPr>
-            <w:r>
-              <w:rPr>
-                <w:rtl w:val="0"/>
-              </w:rPr>
-            </w:r>
-          </w:p>
-          <w:p>
-            <w:pPr>
-              <w:keepNext w:val="0"/>
-              <w:keepLines w:val="0"/>
-              <w:pageBreakBefore w:val="0"/>
-              <w:widowControl w:val="0"/>
-              <w:pBdr>
-                <w:top w:space="0" w:sz="0" w:val="nil"/>
-                <w:left w:space="0" w:sz="0" w:val="nil"/>
-                <w:bottom w:space="0" w:sz="0" w:val="nil"/>
-                <w:right w:space="0" w:sz="0" w:val="nil"/>
-                <w:between w:space="0" w:sz="0" w:val="nil"/>
-              </w:pBdr>
-              <w:shd w:fill="auto" w:val="clear"/>
-              <w:spacing w:after="0" w:before="0" w:line="240" w:lineRule="auto"/>
-              <w:ind w:left="0" w:right="0" w:firstLine="0"/>
-              <w:jc w:val="left"/>
-              <w:rPr/>
-            </w:pPr>
-            <w:r>
-              <w:rPr>
-                <w:rtl w:val="0"/>
-              </w:rPr>
+            <w:r>
+              <w:t>1. Evidence - Oxford Economics' '20 million jobs by 2030' figure is much more convincing than a random post saying 'robots will end work', because it is based on real robotics data (International Federation of Robotics figures).</w:t>
+            </w:r>
+          </w:p>
+          <w:p>
+            <w:r>
+              <w:t>2. Balance - Gates admits new jobs will be created but explains the transition hurts the poorest most - a balanced argument is more convincing than a one-sided doomsday claim.</w:t>
+            </w:r>
+          </w:p>
+          <w:p>
+            <w:r>
+              <w:t>3. Authority - a study from the Oxford Martin School (Frey &amp; Osborne) carries more weight than an anonymous social media opinion because of the institution's reputation and published methodology.</w:t>
             </w:r>
           </w:p>
         </w:tc>
@@ -16407,6 +14983,63 @@
             <w:vAlign w:val="top"/>
           </w:tcPr>
           <w:p>
+            <w:r>
+              <w:t>"The rise of the robots will boost productivity and economic growth... But existing business models in many sectors will be seriously disrupted."</w:t>
+            </w:r>
+          </w:p>
+        </w:tc>
+        <w:tc>
+          <w:tcPr>
+            <w:shd w:fill="auto" w:val="clear"/>
+            <w:tcMar>
+              <w:top w:w="100.0" w:type="dxa"/>
+              <w:left w:w="100.0" w:type="dxa"/>
+              <w:bottom w:w="100.0" w:type="dxa"/>
+              <w:right w:w="100.0" w:type="dxa"/>
+            </w:tcMar>
+            <w:vAlign w:val="top"/>
+          </w:tcPr>
+          <w:p>
+            <w:r>
+              <w:t>An opinion/prediction about future effects - it cannot be proven; it is the authors' judgement on what matters most.</w:t>
+            </w:r>
+          </w:p>
+        </w:tc>
+        <w:tc>
+          <w:tcPr>
+            <w:shd w:fill="auto" w:val="clear"/>
+            <w:tcMar>
+              <w:top w:w="100.0" w:type="dxa"/>
+              <w:left w:w="100.0" w:type="dxa"/>
+              <w:bottom w:w="100.0" w:type="dxa"/>
+              <w:right w:w="100.0" w:type="dxa"/>
+            </w:tcMar>
+            <w:vAlign w:val="top"/>
+          </w:tcPr>
+          <w:p>
+            <w:r>
+              <w:t>https://www.oxfordeconomics.com/resource/how-robots-change-the-world/</w:t>
+            </w:r>
+          </w:p>
+        </w:tc>
+      </w:tr>
+      <w:tr>
+        <w:trPr>
+          <w:cantSplit w:val="0"/>
+          <w:tblHeader w:val="0"/>
+        </w:trPr>
+        <w:tc>
+          <w:tcPr>
+            <w:shd w:fill="auto" w:val="clear"/>
+            <w:tcMar>
+              <w:top w:w="100.0" w:type="dxa"/>
+              <w:left w:w="100.0" w:type="dxa"/>
+              <w:bottom w:w="100.0" w:type="dxa"/>
+              <w:right w:w="100.0" w:type="dxa"/>
+            </w:tcMar>
+            <w:vAlign w:val="top"/>
+          </w:tcPr>
+          <w:p>
             <w:pPr>
               <w:keepNext w:val="0"/>
               <w:keepLines w:val="0"/>
@@ -16430,11 +15063,71 @@
             </w:pPr>
             <w:r>
               <w:rPr>
-                <w:rtl w:val="0"/>
-              </w:rPr>
-            </w:r>
-          </w:p>
-        </w:tc>
+                <w:b w:val="1"/>
+                <w:bCs w:val="1"/>
+                <w:rtl w:val="0"/>
+              </w:rPr>
+              <w:t xml:space="preserve">FACT</w:t>
+            </w:r>
+          </w:p>
+        </w:tc>
+        <w:tc>
+          <w:tcPr>
+            <w:shd w:fill="auto" w:val="clear"/>
+            <w:tcMar>
+              <w:top w:w="100.0" w:type="dxa"/>
+              <w:left w:w="100.0" w:type="dxa"/>
+              <w:bottom w:w="100.0" w:type="dxa"/>
+              <w:right w:w="100.0" w:type="dxa"/>
+            </w:tcMar>
+            <w:vAlign w:val="top"/>
+          </w:tcPr>
+          <w:p>
+            <w:r>
+              <w:t>"We estimate up to 20 million manufacturing jobs are set to be lost to robots by 2030."</w:t>
+            </w:r>
+          </w:p>
+        </w:tc>
+        <w:tc>
+          <w:tcPr>
+            <w:shd w:fill="auto" w:val="clear"/>
+            <w:tcMar>
+              <w:top w:w="100.0" w:type="dxa"/>
+              <w:left w:w="100.0" w:type="dxa"/>
+              <w:bottom w:w="100.0" w:type="dxa"/>
+              <w:right w:w="100.0" w:type="dxa"/>
+            </w:tcMar>
+            <w:vAlign w:val="top"/>
+          </w:tcPr>
+          <w:p>
+            <w:r>
+              <w:t>A specific, checkable statistic with a published methodology - it can be tested against data.</w:t>
+            </w:r>
+          </w:p>
+        </w:tc>
+        <w:tc>
+          <w:tcPr>
+            <w:shd w:fill="auto" w:val="clear"/>
+            <w:tcMar>
+              <w:top w:w="100.0" w:type="dxa"/>
+              <w:left w:w="100.0" w:type="dxa"/>
+              <w:bottom w:w="100.0" w:type="dxa"/>
+              <w:right w:w="100.0" w:type="dxa"/>
+            </w:tcMar>
+            <w:vAlign w:val="top"/>
+          </w:tcPr>
+          <w:p>
+            <w:r>
+              <w:t>https://www.oxfordeconomics.com/resource/how-robots-change-the-world/</w:t>
+            </w:r>
+          </w:p>
+        </w:tc>
+      </w:tr>
+      <w:tr>
+        <w:trPr>
+          <w:cantSplit w:val="0"/>
+          <w:tblHeader w:val="0"/>
+        </w:trPr>
         <w:tc>
           <w:tcPr>
             <w:shd w:fill="auto" w:val="clear"/>
@@ -16470,8 +15163,11 @@
             </w:pPr>
             <w:r>
               <w:rPr>
-                <w:rtl w:val="0"/>
-              </w:rPr>
+                <w:b w:val="1"/>
+                <w:bCs w:val="1"/>
+                <w:rtl w:val="0"/>
+              </w:rPr>
+              <w:t xml:space="preserve">PREDICTION</w:t>
             </w:r>
           </w:p>
         </w:tc>
@@ -16487,40 +15183,11 @@
             <w:vAlign w:val="top"/>
           </w:tcPr>
           <w:p>
-            <w:pPr>
-              <w:keepNext w:val="0"/>
-              <w:keepLines w:val="0"/>
-              <w:pageBreakBefore w:val="0"/>
-              <w:widowControl w:val="0"/>
-              <w:pBdr>
-                <w:top w:space="0" w:sz="0" w:val="nil"/>
-                <w:left w:space="0" w:sz="0" w:val="nil"/>
-                <w:bottom w:space="0" w:sz="0" w:val="nil"/>
-                <w:right w:space="0" w:sz="0" w:val="nil"/>
-                <w:between w:space="0" w:sz="0" w:val="nil"/>
-              </w:pBdr>
-              <w:shd w:fill="auto" w:val="clear"/>
-              <w:spacing w:after="0" w:before="0" w:line="240" w:lineRule="auto"/>
-              <w:ind w:left="0" w:right="0" w:firstLine="0"/>
-              <w:jc w:val="left"/>
-              <w:rPr>
-                <w:b w:val="1"/>
-                <w:bCs w:val="1"/>
-              </w:rPr>
-            </w:pPr>
-            <w:r>
-              <w:rPr>
-                <w:rtl w:val="0"/>
-              </w:rPr>
-            </w:r>
-          </w:p>
-        </w:tc>
-      </w:tr>
-      <w:tr>
-        <w:trPr>
-          <w:cantSplit w:val="0"/>
-          <w:tblHeader w:val="0"/>
-        </w:trPr>
+            <w:r>
+              <w:t>"About 47% of total US employment is at risk" of computerisation (Frey &amp; Osborne, 2013).</w:t>
+            </w:r>
+          </w:p>
+        </w:tc>
         <w:tc>
           <w:tcPr>
             <w:shd w:fill="auto" w:val="clear"/>
@@ -16533,34 +15200,8 @@
             <w:vAlign w:val="top"/>
           </w:tcPr>
           <w:p>
-            <w:pPr>
-              <w:keepNext w:val="0"/>
-              <w:keepLines w:val="0"/>
-              <w:pageBreakBefore w:val="0"/>
-              <w:widowControl w:val="0"/>
-              <w:pBdr>
-                <w:top w:space="0" w:sz="0" w:val="nil"/>
-                <w:left w:space="0" w:sz="0" w:val="nil"/>
-                <w:bottom w:space="0" w:sz="0" w:val="nil"/>
-                <w:right w:space="0" w:sz="0" w:val="nil"/>
-                <w:between w:space="0" w:sz="0" w:val="nil"/>
-              </w:pBdr>
-              <w:shd w:fill="auto" w:val="clear"/>
-              <w:spacing w:after="0" w:before="0" w:line="240" w:lineRule="auto"/>
-              <w:ind w:left="0" w:right="0" w:firstLine="0"/>
-              <w:jc w:val="left"/>
-              <w:rPr>
-                <w:b w:val="1"/>
-                <w:bCs w:val="1"/>
-              </w:rPr>
-            </w:pPr>
-            <w:r>
-              <w:rPr>
-                <w:b w:val="1"/>
-                <w:bCs w:val="1"/>
-                <w:rtl w:val="0"/>
-              </w:rPr>
-              <w:t xml:space="preserve">FACT</w:t>
+            <w:r>
+              <w:t>A prediction - a forecast of future job risk based on modelling each occupation's probability of automation.</w:t>
             </w:r>
           </w:p>
         </w:tc>
@@ -16576,280 +15217,8 @@
             <w:vAlign w:val="top"/>
           </w:tcPr>
           <w:p>
-            <w:pPr>
-              <w:keepNext w:val="0"/>
-              <w:keepLines w:val="0"/>
-              <w:pageBreakBefore w:val="0"/>
-              <w:widowControl w:val="0"/>
-              <w:pBdr>
-                <w:top w:space="0" w:sz="0" w:val="nil"/>
-                <w:left w:space="0" w:sz="0" w:val="nil"/>
-                <w:bottom w:space="0" w:sz="0" w:val="nil"/>
-                <w:right w:space="0" w:sz="0" w:val="nil"/>
-                <w:between w:space="0" w:sz="0" w:val="nil"/>
-              </w:pBdr>
-              <w:shd w:fill="auto" w:val="clear"/>
-              <w:spacing w:after="0" w:before="0" w:line="240" w:lineRule="auto"/>
-              <w:ind w:left="0" w:right="0" w:firstLine="0"/>
-              <w:jc w:val="left"/>
-              <w:rPr>
-                <w:b w:val="1"/>
-                <w:bCs w:val="1"/>
-              </w:rPr>
-            </w:pPr>
-            <w:r>
-              <w:rPr>
-                <w:rtl w:val="0"/>
-              </w:rPr>
-            </w:r>
-          </w:p>
-        </w:tc>
-        <w:tc>
-          <w:tcPr>
-            <w:shd w:fill="auto" w:val="clear"/>
-            <w:tcMar>
-              <w:top w:w="100.0" w:type="dxa"/>
-              <w:left w:w="100.0" w:type="dxa"/>
-              <w:bottom w:w="100.0" w:type="dxa"/>
-              <w:right w:w="100.0" w:type="dxa"/>
-            </w:tcMar>
-            <w:vAlign w:val="top"/>
-          </w:tcPr>
-          <w:p>
-            <w:pPr>
-              <w:keepNext w:val="0"/>
-              <w:keepLines w:val="0"/>
-              <w:pageBreakBefore w:val="0"/>
-              <w:widowControl w:val="0"/>
-              <w:pBdr>
-                <w:top w:space="0" w:sz="0" w:val="nil"/>
-                <w:left w:space="0" w:sz="0" w:val="nil"/>
-                <w:bottom w:space="0" w:sz="0" w:val="nil"/>
-                <w:right w:space="0" w:sz="0" w:val="nil"/>
-                <w:between w:space="0" w:sz="0" w:val="nil"/>
-              </w:pBdr>
-              <w:shd w:fill="auto" w:val="clear"/>
-              <w:spacing w:after="0" w:before="0" w:line="240" w:lineRule="auto"/>
-              <w:ind w:left="0" w:right="0" w:firstLine="0"/>
-              <w:jc w:val="left"/>
-              <w:rPr>
-                <w:b w:val="1"/>
-                <w:bCs w:val="1"/>
-              </w:rPr>
-            </w:pPr>
-            <w:r>
-              <w:rPr>
-                <w:rtl w:val="0"/>
-              </w:rPr>
-            </w:r>
-          </w:p>
-        </w:tc>
-        <w:tc>
-          <w:tcPr>
-            <w:shd w:fill="auto" w:val="clear"/>
-            <w:tcMar>
-              <w:top w:w="100.0" w:type="dxa"/>
-              <w:left w:w="100.0" w:type="dxa"/>
-              <w:bottom w:w="100.0" w:type="dxa"/>
-              <w:right w:w="100.0" w:type="dxa"/>
-            </w:tcMar>
-            <w:vAlign w:val="top"/>
-          </w:tcPr>
-          <w:p>
-            <w:pPr>
-              <w:keepNext w:val="0"/>
-              <w:keepLines w:val="0"/>
-              <w:pageBreakBefore w:val="0"/>
-              <w:widowControl w:val="0"/>
-              <w:pBdr>
-                <w:top w:space="0" w:sz="0" w:val="nil"/>
-                <w:left w:space="0" w:sz="0" w:val="nil"/>
-                <w:bottom w:space="0" w:sz="0" w:val="nil"/>
-                <w:right w:space="0" w:sz="0" w:val="nil"/>
-                <w:between w:space="0" w:sz="0" w:val="nil"/>
-              </w:pBdr>
-              <w:shd w:fill="auto" w:val="clear"/>
-              <w:spacing w:after="0" w:before="0" w:line="240" w:lineRule="auto"/>
-              <w:ind w:left="0" w:right="0" w:firstLine="0"/>
-              <w:jc w:val="left"/>
-              <w:rPr>
-                <w:b w:val="1"/>
-                <w:bCs w:val="1"/>
-              </w:rPr>
-            </w:pPr>
-            <w:r>
-              <w:rPr>
-                <w:rtl w:val="0"/>
-              </w:rPr>
-            </w:r>
-          </w:p>
-        </w:tc>
-      </w:tr>
-      <w:tr>
-        <w:trPr>
-          <w:cantSplit w:val="0"/>
-          <w:tblHeader w:val="0"/>
-        </w:trPr>
-        <w:tc>
-          <w:tcPr>
-            <w:shd w:fill="auto" w:val="clear"/>
-            <w:tcMar>
-              <w:top w:w="100.0" w:type="dxa"/>
-              <w:left w:w="100.0" w:type="dxa"/>
-              <w:bottom w:w="100.0" w:type="dxa"/>
-              <w:right w:w="100.0" w:type="dxa"/>
-            </w:tcMar>
-            <w:vAlign w:val="top"/>
-          </w:tcPr>
-          <w:p>
-            <w:pPr>
-              <w:keepNext w:val="0"/>
-              <w:keepLines w:val="0"/>
-              <w:pageBreakBefore w:val="0"/>
-              <w:widowControl w:val="0"/>
-              <w:pBdr>
-                <w:top w:space="0" w:sz="0" w:val="nil"/>
-                <w:left w:space="0" w:sz="0" w:val="nil"/>
-                <w:bottom w:space="0" w:sz="0" w:val="nil"/>
-                <w:right w:space="0" w:sz="0" w:val="nil"/>
-                <w:between w:space="0" w:sz="0" w:val="nil"/>
-              </w:pBdr>
-              <w:shd w:fill="auto" w:val="clear"/>
-              <w:spacing w:after="0" w:before="0" w:line="240" w:lineRule="auto"/>
-              <w:ind w:left="0" w:right="0" w:firstLine="0"/>
-              <w:jc w:val="left"/>
-              <w:rPr>
-                <w:b w:val="1"/>
-                <w:bCs w:val="1"/>
-              </w:rPr>
-            </w:pPr>
-            <w:r>
-              <w:rPr>
-                <w:b w:val="1"/>
-                <w:bCs w:val="1"/>
-                <w:rtl w:val="0"/>
-              </w:rPr>
-              <w:t xml:space="preserve">PREDICTION</w:t>
-            </w:r>
-          </w:p>
-        </w:tc>
-        <w:tc>
-          <w:tcPr>
-            <w:shd w:fill="auto" w:val="clear"/>
-            <w:tcMar>
-              <w:top w:w="100.0" w:type="dxa"/>
-              <w:left w:w="100.0" w:type="dxa"/>
-              <w:bottom w:w="100.0" w:type="dxa"/>
-              <w:right w:w="100.0" w:type="dxa"/>
-            </w:tcMar>
-            <w:vAlign w:val="top"/>
-          </w:tcPr>
-          <w:p>
-            <w:pPr>
-              <w:keepNext w:val="0"/>
-              <w:keepLines w:val="0"/>
-              <w:pageBreakBefore w:val="0"/>
-              <w:widowControl w:val="0"/>
-              <w:pBdr>
-                <w:top w:space="0" w:sz="0" w:val="nil"/>
-                <w:left w:space="0" w:sz="0" w:val="nil"/>
-                <w:bottom w:space="0" w:sz="0" w:val="nil"/>
-                <w:right w:space="0" w:sz="0" w:val="nil"/>
-                <w:between w:space="0" w:sz="0" w:val="nil"/>
-              </w:pBdr>
-              <w:shd w:fill="auto" w:val="clear"/>
-              <w:spacing w:after="0" w:before="0" w:line="240" w:lineRule="auto"/>
-              <w:ind w:left="0" w:right="0" w:firstLine="0"/>
-              <w:jc w:val="left"/>
-              <w:rPr>
-                <w:b w:val="1"/>
-                <w:bCs w:val="1"/>
-              </w:rPr>
-            </w:pPr>
-            <w:r>
-              <w:rPr>
-                <w:rtl w:val="0"/>
-              </w:rPr>
-            </w:r>
-          </w:p>
-        </w:tc>
-        <w:tc>
-          <w:tcPr>
-            <w:shd w:fill="auto" w:val="clear"/>
-            <w:tcMar>
-              <w:top w:w="100.0" w:type="dxa"/>
-              <w:left w:w="100.0" w:type="dxa"/>
-              <w:bottom w:w="100.0" w:type="dxa"/>
-              <w:right w:w="100.0" w:type="dxa"/>
-            </w:tcMar>
-            <w:vAlign w:val="top"/>
-          </w:tcPr>
-          <w:p>
-            <w:pPr>
-              <w:keepNext w:val="0"/>
-              <w:keepLines w:val="0"/>
-              <w:pageBreakBefore w:val="0"/>
-              <w:widowControl w:val="0"/>
-              <w:pBdr>
-                <w:top w:space="0" w:sz="0" w:val="nil"/>
-                <w:left w:space="0" w:sz="0" w:val="nil"/>
-                <w:bottom w:space="0" w:sz="0" w:val="nil"/>
-                <w:right w:space="0" w:sz="0" w:val="nil"/>
-                <w:between w:space="0" w:sz="0" w:val="nil"/>
-              </w:pBdr>
-              <w:shd w:fill="auto" w:val="clear"/>
-              <w:spacing w:after="0" w:before="0" w:line="240" w:lineRule="auto"/>
-              <w:ind w:left="0" w:right="0" w:firstLine="0"/>
-              <w:jc w:val="left"/>
-              <w:rPr>
-                <w:b w:val="1"/>
-                <w:bCs w:val="1"/>
-              </w:rPr>
-            </w:pPr>
-            <w:r>
-              <w:rPr>
-                <w:rtl w:val="0"/>
-              </w:rPr>
-            </w:r>
-          </w:p>
-        </w:tc>
-        <w:tc>
-          <w:tcPr>
-            <w:shd w:fill="auto" w:val="clear"/>
-            <w:tcMar>
-              <w:top w:w="100.0" w:type="dxa"/>
-              <w:left w:w="100.0" w:type="dxa"/>
-              <w:bottom w:w="100.0" w:type="dxa"/>
-              <w:right w:w="100.0" w:type="dxa"/>
-            </w:tcMar>
-            <w:vAlign w:val="top"/>
-          </w:tcPr>
-          <w:p>
-            <w:pPr>
-              <w:keepNext w:val="0"/>
-              <w:keepLines w:val="0"/>
-              <w:pageBreakBefore w:val="0"/>
-              <w:widowControl w:val="0"/>
-              <w:pBdr>
-                <w:top w:space="0" w:sz="0" w:val="nil"/>
-                <w:left w:space="0" w:sz="0" w:val="nil"/>
-                <w:bottom w:space="0" w:sz="0" w:val="nil"/>
-                <w:right w:space="0" w:sz="0" w:val="nil"/>
-                <w:between w:space="0" w:sz="0" w:val="nil"/>
-              </w:pBdr>
-              <w:shd w:fill="auto" w:val="clear"/>
-              <w:spacing w:after="0" w:before="0" w:line="240" w:lineRule="auto"/>
-              <w:ind w:left="0" w:right="0" w:firstLine="0"/>
-              <w:jc w:val="left"/>
-              <w:rPr>
-                <w:b w:val="1"/>
-                <w:bCs w:val="1"/>
-              </w:rPr>
-            </w:pPr>
-            <w:r>
-              <w:rPr>
-                <w:rtl w:val="0"/>
-              </w:rPr>
+            <w:r>
+              <w:t>https://www.oxfordmartin.ox.ac.uk/publications/the-future-of-employment/</w:t>
             </w:r>
           </w:p>
         </w:tc>
@@ -17262,174 +15631,13 @@
             <w:vAlign w:val="top"/>
           </w:tcPr>
           <w:p>
-            <w:pPr>
-              <w:keepNext w:val="0"/>
-              <w:keepLines w:val="0"/>
-              <w:pageBreakBefore w:val="0"/>
-              <w:widowControl w:val="0"/>
-              <w:pBdr>
-                <w:top w:space="0" w:sz="0" w:val="nil"/>
-                <w:left w:space="0" w:sz="0" w:val="nil"/>
-                <w:bottom w:space="0" w:sz="0" w:val="nil"/>
-                <w:right w:space="0" w:sz="0" w:val="nil"/>
-                <w:between w:space="0" w:sz="0" w:val="nil"/>
-              </w:pBdr>
-              <w:shd w:fill="auto" w:val="clear"/>
-              <w:spacing w:after="0" w:before="0" w:line="240" w:lineRule="auto"/>
-              <w:ind w:left="0" w:right="0" w:firstLine="0"/>
-              <w:jc w:val="left"/>
-              <w:rPr>
-                <w:b w:val="1"/>
-                <w:bCs w:val="1"/>
-              </w:rPr>
-            </w:pPr>
-            <w:r>
-              <w:rPr>
-                <w:b w:val="1"/>
-                <w:bCs w:val="1"/>
-                <w:rtl w:val="0"/>
-              </w:rPr>
-              <w:t xml:space="preserve">1</w:t>
-            </w:r>
-          </w:p>
-          <w:p>
-            <w:pPr>
-              <w:keepNext w:val="0"/>
-              <w:keepLines w:val="0"/>
-              <w:pageBreakBefore w:val="0"/>
-              <w:widowControl w:val="0"/>
-              <w:pBdr>
-                <w:top w:space="0" w:sz="0" w:val="nil"/>
-                <w:left w:space="0" w:sz="0" w:val="nil"/>
-                <w:bottom w:space="0" w:sz="0" w:val="nil"/>
-                <w:right w:space="0" w:sz="0" w:val="nil"/>
-                <w:between w:space="0" w:sz="0" w:val="nil"/>
-              </w:pBdr>
-              <w:shd w:fill="auto" w:val="clear"/>
-              <w:spacing w:after="0" w:before="0" w:line="240" w:lineRule="auto"/>
-              <w:ind w:left="0" w:right="0" w:firstLine="0"/>
-              <w:jc w:val="left"/>
-              <w:rPr>
-                <w:b w:val="1"/>
-                <w:bCs w:val="1"/>
-              </w:rPr>
-            </w:pPr>
-            <w:r>
-              <w:rPr>
-                <w:rtl w:val="0"/>
-              </w:rPr>
-            </w:r>
-          </w:p>
-          <w:p>
-            <w:pPr>
-              <w:keepNext w:val="0"/>
-              <w:keepLines w:val="0"/>
-              <w:pageBreakBefore w:val="0"/>
-              <w:widowControl w:val="0"/>
-              <w:pBdr>
-                <w:top w:space="0" w:sz="0" w:val="nil"/>
-                <w:left w:space="0" w:sz="0" w:val="nil"/>
-                <w:bottom w:space="0" w:sz="0" w:val="nil"/>
-                <w:right w:space="0" w:sz="0" w:val="nil"/>
-                <w:between w:space="0" w:sz="0" w:val="nil"/>
-              </w:pBdr>
-              <w:shd w:fill="auto" w:val="clear"/>
-              <w:spacing w:after="0" w:before="0" w:line="240" w:lineRule="auto"/>
-              <w:ind w:left="0" w:right="0" w:firstLine="0"/>
-              <w:jc w:val="left"/>
-              <w:rPr>
-                <w:b w:val="1"/>
-                <w:bCs w:val="1"/>
-              </w:rPr>
-            </w:pPr>
-            <w:r>
-              <w:rPr>
-                <w:rtl w:val="0"/>
-              </w:rPr>
-            </w:r>
-          </w:p>
-          <w:p>
-            <w:pPr>
-              <w:keepNext w:val="0"/>
-              <w:keepLines w:val="0"/>
-              <w:pageBreakBefore w:val="0"/>
-              <w:widowControl w:val="0"/>
-              <w:pBdr>
-                <w:top w:space="0" w:sz="0" w:val="nil"/>
-                <w:left w:space="0" w:sz="0" w:val="nil"/>
-                <w:bottom w:space="0" w:sz="0" w:val="nil"/>
-                <w:right w:space="0" w:sz="0" w:val="nil"/>
-                <w:between w:space="0" w:sz="0" w:val="nil"/>
-              </w:pBdr>
-              <w:shd w:fill="auto" w:val="clear"/>
-              <w:spacing w:after="0" w:before="0" w:line="240" w:lineRule="auto"/>
-              <w:ind w:left="0" w:right="0" w:firstLine="0"/>
-              <w:jc w:val="left"/>
-              <w:rPr>
-                <w:b w:val="1"/>
-                <w:bCs w:val="1"/>
-              </w:rPr>
-            </w:pPr>
-            <w:r>
-              <w:rPr>
-                <w:rtl w:val="0"/>
-              </w:rPr>
-            </w:r>
-          </w:p>
-          <w:p>
-            <w:pPr>
-              <w:keepNext w:val="0"/>
-              <w:keepLines w:val="0"/>
-              <w:pageBreakBefore w:val="0"/>
-              <w:widowControl w:val="0"/>
-              <w:pBdr>
-                <w:top w:space="0" w:sz="0" w:val="nil"/>
-                <w:left w:space="0" w:sz="0" w:val="nil"/>
-                <w:bottom w:space="0" w:sz="0" w:val="nil"/>
-                <w:right w:space="0" w:sz="0" w:val="nil"/>
-                <w:between w:space="0" w:sz="0" w:val="nil"/>
-              </w:pBdr>
-              <w:shd w:fill="auto" w:val="clear"/>
-              <w:spacing w:after="0" w:before="0" w:line="240" w:lineRule="auto"/>
-              <w:ind w:left="0" w:right="0" w:firstLine="0"/>
-              <w:jc w:val="left"/>
-              <w:rPr>
-                <w:b w:val="1"/>
-                <w:bCs w:val="1"/>
-              </w:rPr>
-            </w:pPr>
-            <w:r>
-              <w:rPr>
-                <w:rtl w:val="0"/>
-              </w:rPr>
-            </w:r>
-          </w:p>
-          <w:p>
-            <w:pPr>
-              <w:keepNext w:val="0"/>
-              <w:keepLines w:val="0"/>
-              <w:pageBreakBefore w:val="0"/>
-              <w:widowControl w:val="0"/>
-              <w:pBdr>
-                <w:top w:space="0" w:sz="0" w:val="nil"/>
-                <w:left w:space="0" w:sz="0" w:val="nil"/>
-                <w:bottom w:space="0" w:sz="0" w:val="nil"/>
-                <w:right w:space="0" w:sz="0" w:val="nil"/>
-                <w:between w:space="0" w:sz="0" w:val="nil"/>
-              </w:pBdr>
-              <w:shd w:fill="auto" w:val="clear"/>
-              <w:spacing w:after="0" w:before="0" w:line="240" w:lineRule="auto"/>
-              <w:ind w:left="0" w:right="0" w:firstLine="0"/>
-              <w:jc w:val="left"/>
-              <w:rPr>
-                <w:b w:val="1"/>
-                <w:bCs w:val="1"/>
-              </w:rPr>
-            </w:pPr>
-            <w:r>
-              <w:rPr>
-                <w:rtl w:val="0"/>
-              </w:rPr>
+            <w:r>
+              <w:t>Source 1: Oxford Economics - 'How Robots Change the World' (2019), research/consultancy report</w:t>
+            </w:r>
+          </w:p>
+          <w:p>
+            <w:r>
+              <w:t>https://www.oxfordeconomics.com/resource/how-robots-change-the-world/</w:t>
             </w:r>
           </w:p>
         </w:tc>
@@ -17445,31 +15653,33 @@
             <w:vAlign w:val="top"/>
           </w:tcPr>
           <w:p>
-            <w:pPr>
-              <w:keepNext w:val="0"/>
-              <w:keepLines w:val="0"/>
-              <w:pageBreakBefore w:val="0"/>
-              <w:widowControl w:val="0"/>
-              <w:pBdr>
-                <w:top w:space="0" w:sz="0" w:val="nil"/>
-                <w:left w:space="0" w:sz="0" w:val="nil"/>
-                <w:bottom w:space="0" w:sz="0" w:val="nil"/>
-                <w:right w:space="0" w:sz="0" w:val="nil"/>
-                <w:between w:space="0" w:sz="0" w:val="nil"/>
-              </w:pBdr>
-              <w:shd w:fill="auto" w:val="clear"/>
-              <w:spacing w:after="0" w:before="0" w:line="240" w:lineRule="auto"/>
-              <w:ind w:left="0" w:right="0" w:firstLine="0"/>
-              <w:jc w:val="left"/>
-              <w:rPr>
-                <w:b w:val="1"/>
-                <w:bCs w:val="1"/>
-              </w:rPr>
-            </w:pPr>
-            <w:r>
-              <w:rPr>
-                <w:rtl w:val="0"/>
-              </w:rPr>
+            <w:r>
+              <w:t>Currency: 2019 - recent enough for a fast-moving topic (still the most-cited figure)</w:t>
+            </w:r>
+          </w:p>
+          <w:p>
+            <w:r>
+              <w:t>Relevance: directly about robots and manufacturing jobs, including poorer local economies - highly relevant</w:t>
+            </w:r>
+          </w:p>
+          <w:p>
+            <w:r>
+              <w:t>Authority: independent economic research consultancy whose reports are used by governments and the UN; methods published</w:t>
+            </w:r>
+          </w:p>
+          <w:p>
+            <w:r>
+              <w:t>Accuracy: based on International Federation of Robotics data; balanced (admits new jobs also appear)</w:t>
+            </w:r>
+          </w:p>
+          <w:p>
+            <w:r>
+              <w:t>Purpose: inform governments/businesses and influence policy - no adverts, but has clients, so broadly neutral</w:t>
+            </w:r>
+          </w:p>
+          <w:p>
+            <w:r>
+              <w:t>Verdict: reliable - use its data as evidence.</w:t>
             </w:r>
           </w:p>
         </w:tc>
@@ -17491,174 +15701,13 @@
             <w:vAlign w:val="top"/>
           </w:tcPr>
           <w:p>
-            <w:pPr>
-              <w:keepNext w:val="0"/>
-              <w:keepLines w:val="0"/>
-              <w:pageBreakBefore w:val="0"/>
-              <w:widowControl w:val="0"/>
-              <w:pBdr>
-                <w:top w:space="0" w:sz="0" w:val="nil"/>
-                <w:left w:space="0" w:sz="0" w:val="nil"/>
-                <w:bottom w:space="0" w:sz="0" w:val="nil"/>
-                <w:right w:space="0" w:sz="0" w:val="nil"/>
-                <w:between w:space="0" w:sz="0" w:val="nil"/>
-              </w:pBdr>
-              <w:shd w:fill="auto" w:val="clear"/>
-              <w:spacing w:after="0" w:before="0" w:line="240" w:lineRule="auto"/>
-              <w:ind w:left="0" w:right="0" w:firstLine="0"/>
-              <w:jc w:val="left"/>
-              <w:rPr>
-                <w:b w:val="1"/>
-                <w:bCs w:val="1"/>
-              </w:rPr>
-            </w:pPr>
-            <w:r>
-              <w:rPr>
-                <w:rtl w:val="0"/>
-              </w:rPr>
-            </w:r>
-          </w:p>
-          <w:p>
-            <w:pPr>
-              <w:keepNext w:val="0"/>
-              <w:keepLines w:val="0"/>
-              <w:pageBreakBefore w:val="0"/>
-              <w:widowControl w:val="0"/>
-              <w:pBdr>
-                <w:top w:space="0" w:sz="0" w:val="nil"/>
-                <w:left w:space="0" w:sz="0" w:val="nil"/>
-                <w:bottom w:space="0" w:sz="0" w:val="nil"/>
-                <w:right w:space="0" w:sz="0" w:val="nil"/>
-                <w:between w:space="0" w:sz="0" w:val="nil"/>
-              </w:pBdr>
-              <w:shd w:fill="auto" w:val="clear"/>
-              <w:spacing w:after="0" w:before="0" w:line="240" w:lineRule="auto"/>
-              <w:ind w:left="0" w:right="0" w:firstLine="0"/>
-              <w:jc w:val="left"/>
-              <w:rPr>
-                <w:b w:val="1"/>
-                <w:bCs w:val="1"/>
-              </w:rPr>
-            </w:pPr>
-            <w:r>
-              <w:rPr>
-                <w:b w:val="1"/>
-                <w:bCs w:val="1"/>
-                <w:rtl w:val="0"/>
-              </w:rPr>
-              <w:t xml:space="preserve">2</w:t>
-            </w:r>
-          </w:p>
-          <w:p>
-            <w:pPr>
-              <w:keepNext w:val="0"/>
-              <w:keepLines w:val="0"/>
-              <w:pageBreakBefore w:val="0"/>
-              <w:widowControl w:val="0"/>
-              <w:pBdr>
-                <w:top w:space="0" w:sz="0" w:val="nil"/>
-                <w:left w:space="0" w:sz="0" w:val="nil"/>
-                <w:bottom w:space="0" w:sz="0" w:val="nil"/>
-                <w:right w:space="0" w:sz="0" w:val="nil"/>
-                <w:between w:space="0" w:sz="0" w:val="nil"/>
-              </w:pBdr>
-              <w:shd w:fill="auto" w:val="clear"/>
-              <w:spacing w:after="0" w:before="0" w:line="240" w:lineRule="auto"/>
-              <w:ind w:left="0" w:right="0" w:firstLine="0"/>
-              <w:jc w:val="left"/>
-              <w:rPr>
-                <w:b w:val="1"/>
-                <w:bCs w:val="1"/>
-              </w:rPr>
-            </w:pPr>
-            <w:r>
-              <w:rPr>
-                <w:rtl w:val="0"/>
-              </w:rPr>
-            </w:r>
-          </w:p>
-          <w:p>
-            <w:pPr>
-              <w:keepNext w:val="0"/>
-              <w:keepLines w:val="0"/>
-              <w:pageBreakBefore w:val="0"/>
-              <w:widowControl w:val="0"/>
-              <w:pBdr>
-                <w:top w:space="0" w:sz="0" w:val="nil"/>
-                <w:left w:space="0" w:sz="0" w:val="nil"/>
-                <w:bottom w:space="0" w:sz="0" w:val="nil"/>
-                <w:right w:space="0" w:sz="0" w:val="nil"/>
-                <w:between w:space="0" w:sz="0" w:val="nil"/>
-              </w:pBdr>
-              <w:shd w:fill="auto" w:val="clear"/>
-              <w:spacing w:after="0" w:before="0" w:line="240" w:lineRule="auto"/>
-              <w:ind w:left="0" w:right="0" w:firstLine="0"/>
-              <w:jc w:val="left"/>
-              <w:rPr>
-                <w:b w:val="1"/>
-                <w:bCs w:val="1"/>
-              </w:rPr>
-            </w:pPr>
-            <w:r>
-              <w:rPr>
-                <w:rtl w:val="0"/>
-              </w:rPr>
-            </w:r>
-          </w:p>
-          <w:p>
-            <w:pPr>
-              <w:keepNext w:val="0"/>
-              <w:keepLines w:val="0"/>
-              <w:pageBreakBefore w:val="0"/>
-              <w:widowControl w:val="0"/>
-              <w:pBdr>
-                <w:top w:space="0" w:sz="0" w:val="nil"/>
-                <w:left w:space="0" w:sz="0" w:val="nil"/>
-                <w:bottom w:space="0" w:sz="0" w:val="nil"/>
-                <w:right w:space="0" w:sz="0" w:val="nil"/>
-                <w:between w:space="0" w:sz="0" w:val="nil"/>
-              </w:pBdr>
-              <w:shd w:fill="auto" w:val="clear"/>
-              <w:spacing w:after="0" w:before="0" w:line="240" w:lineRule="auto"/>
-              <w:ind w:left="0" w:right="0" w:firstLine="0"/>
-              <w:jc w:val="left"/>
-              <w:rPr>
-                <w:b w:val="1"/>
-                <w:bCs w:val="1"/>
-              </w:rPr>
-            </w:pPr>
-            <w:r>
-              <w:rPr>
-                <w:rtl w:val="0"/>
-              </w:rPr>
-            </w:r>
-          </w:p>
-          <w:p>
-            <w:pPr>
-              <w:keepNext w:val="0"/>
-              <w:keepLines w:val="0"/>
-              <w:pageBreakBefore w:val="0"/>
-              <w:widowControl w:val="0"/>
-              <w:pBdr>
-                <w:top w:space="0" w:sz="0" w:val="nil"/>
-                <w:left w:space="0" w:sz="0" w:val="nil"/>
-                <w:bottom w:space="0" w:sz="0" w:val="nil"/>
-                <w:right w:space="0" w:sz="0" w:val="nil"/>
-                <w:between w:space="0" w:sz="0" w:val="nil"/>
-              </w:pBdr>
-              <w:shd w:fill="auto" w:val="clear"/>
-              <w:spacing w:after="0" w:before="0" w:line="240" w:lineRule="auto"/>
-              <w:ind w:left="0" w:right="0" w:firstLine="0"/>
-              <w:jc w:val="left"/>
-              <w:rPr>
-                <w:b w:val="1"/>
-                <w:bCs w:val="1"/>
-              </w:rPr>
-            </w:pPr>
-            <w:r>
-              <w:rPr>
-                <w:rtl w:val="0"/>
-              </w:rPr>
+            <w:r>
+              <w:t>Source 2: Wikipedia - 'Technological unemployment' (encyclopaedia/reference page)</w:t>
+            </w:r>
+          </w:p>
+          <w:p>
+            <w:r>
+              <w:t>https://en.wikipedia.org/wiki/Technological_unemployment</w:t>
             </w:r>
           </w:p>
         </w:tc>
@@ -17674,31 +15723,33 @@
             <w:vAlign w:val="top"/>
           </w:tcPr>
           <w:p>
-            <w:pPr>
-              <w:keepNext w:val="0"/>
-              <w:keepLines w:val="0"/>
-              <w:pageBreakBefore w:val="0"/>
-              <w:widowControl w:val="0"/>
-              <w:pBdr>
-                <w:top w:space="0" w:sz="0" w:val="nil"/>
-                <w:left w:space="0" w:sz="0" w:val="nil"/>
-                <w:bottom w:space="0" w:sz="0" w:val="nil"/>
-                <w:right w:space="0" w:sz="0" w:val="nil"/>
-                <w:between w:space="0" w:sz="0" w:val="nil"/>
-              </w:pBdr>
-              <w:shd w:fill="auto" w:val="clear"/>
-              <w:spacing w:after="0" w:before="0" w:line="240" w:lineRule="auto"/>
-              <w:ind w:left="0" w:right="0" w:firstLine="0"/>
-              <w:jc w:val="left"/>
-              <w:rPr>
-                <w:b w:val="1"/>
-                <w:bCs w:val="1"/>
-              </w:rPr>
-            </w:pPr>
-            <w:r>
-              <w:rPr>
-                <w:rtl w:val="0"/>
-              </w:rPr>
+            <w:r>
+              <w:t>Currency: continuously updated (2024-25)</w:t>
+            </w:r>
+          </w:p>
+          <w:p>
+            <w:r>
+              <w:t>Relevance: covers exactly this issue, including developing countries</w:t>
+            </w:r>
+          </w:p>
+          <w:p>
+            <w:r>
+              <w:t>Authority: medium - written by volunteer editors, but every claim must link to an original source (e.g. Keynes, Frey &amp; Osborne)</w:t>
+            </w:r>
+          </w:p>
+          <w:p>
+            <w:r>
+              <w:t>Accuracy: high - it summarises verified studies rather than making new claims</w:t>
+            </w:r>
+          </w:p>
+          <w:p>
+            <w:r>
+              <w:t>Purpose: inform, neutral overview</w:t>
+            </w:r>
+          </w:p>
+          <w:p>
+            <w:r>
+              <w:t>Verdict: good for locating ideas and finding the original sources; don't cite Wikipedia itself in a final essay - follow its footnotes.</w:t>
             </w:r>
           </w:p>
         </w:tc>
@@ -18401,19 +16452,8 @@
             <w:vAlign w:val="top"/>
           </w:tcPr>
           <w:p>
-            <w:pPr>
-              <w:pageBreakBefore w:val="0"/>
-              <w:widowControl w:val="0"/>
-              <w:spacing w:line="240" w:lineRule="auto"/>
-              <w:rPr>
-                <w:sz w:val="36"/>
-                <w:szCs w:val="36"/>
-              </w:rPr>
-            </w:pPr>
-            <w:r>
-              <w:rPr>
-                <w:rtl w:val="0"/>
-              </w:rPr>
+            <w:r>
+              <w:t>Rehabilitation - prisoners are treated as people to be fixed, not punished: open prisons like Halden, education and jobs inside, no bars on the windows.</w:t>
             </w:r>
           </w:p>
         </w:tc>
@@ -18428,19 +16468,8 @@
             <w:vAlign w:val="top"/>
           </w:tcPr>
           <w:p>
-            <w:pPr>
-              <w:pageBreakBefore w:val="0"/>
-              <w:widowControl w:val="0"/>
-              <w:spacing w:line="240" w:lineRule="auto"/>
-              <w:rPr>
-                <w:sz w:val="36"/>
-                <w:szCs w:val="36"/>
-              </w:rPr>
-            </w:pPr>
-            <w:r>
-              <w:rPr>
-                <w:rtl w:val="0"/>
-              </w:rPr>
+            <w:r>
+              <w:t>Deterrence - harsh, fast punishment to scare people away from crime: caning, long sentences, and a mandatory death penalty for drug trafficking.</w:t>
             </w:r>
           </w:p>
         </w:tc>
@@ -18496,19 +16525,8 @@
             <w:vAlign w:val="top"/>
           </w:tcPr>
           <w:p>
-            <w:pPr>
-              <w:pageBreakBefore w:val="0"/>
-              <w:widowControl w:val="0"/>
-              <w:spacing w:line="240" w:lineRule="auto"/>
-              <w:rPr>
-                <w:sz w:val="36"/>
-                <w:szCs w:val="36"/>
-              </w:rPr>
-            </w:pPr>
-            <w:r>
-              <w:rPr>
-                <w:rtl w:val="0"/>
-              </w:rPr>
+            <w:r>
+              <w:t>Recidivism (re-offending) is only about 20% - one of the lowest rates in the world; prisoners come out as useful citizens.</w:t>
             </w:r>
           </w:p>
         </w:tc>
@@ -18523,19 +16541,8 @@
             <w:vAlign w:val="top"/>
           </w:tcPr>
           <w:p>
-            <w:pPr>
-              <w:pageBreakBefore w:val="0"/>
-              <w:widowControl w:val="0"/>
-              <w:spacing w:line="240" w:lineRule="auto"/>
-              <w:rPr>
-                <w:sz w:val="36"/>
-                <w:szCs w:val="36"/>
-              </w:rPr>
-            </w:pPr>
-            <w:r>
-              <w:rPr>
-                <w:rtl w:val="0"/>
-              </w:rPr>
+            <w:r>
+              <w:t>Crime stays very low; it is cheap to run; most citizens support it.</w:t>
             </w:r>
           </w:p>
         </w:tc>
@@ -18591,19 +16598,8 @@
             <w:vAlign w:val="top"/>
           </w:tcPr>
           <w:p>
-            <w:pPr>
-              <w:pageBreakBefore w:val="0"/>
-              <w:widowControl w:val="0"/>
-              <w:spacing w:line="240" w:lineRule="auto"/>
-              <w:rPr>
-                <w:sz w:val="36"/>
-                <w:szCs w:val="36"/>
-              </w:rPr>
-            </w:pPr>
-            <w:r>
-              <w:rPr>
-                <w:rtl w:val="0"/>
-              </w:rPr>
+            <w:r>
+              <w:t>Extremely expensive (over US$90,000 per prisoner per year); victims can feel justice was not served; it can look 'soft'.</w:t>
             </w:r>
           </w:p>
         </w:tc>
@@ -18618,19 +16614,8 @@
             <w:vAlign w:val="top"/>
           </w:tcPr>
           <w:p>
-            <w:pPr>
-              <w:pageBreakBefore w:val="0"/>
-              <w:widowControl w:val="0"/>
-              <w:spacing w:line="240" w:lineRule="auto"/>
-              <w:rPr>
-                <w:sz w:val="36"/>
-                <w:szCs w:val="36"/>
-              </w:rPr>
-            </w:pPr>
-            <w:r>
-              <w:rPr>
-                <w:rtl w:val="0"/>
-              </w:rPr>
+            <w:r>
+              <w:t>Human-rights groups criticise caning and the death penalty (which cannot be reversed if a mistake is made).</w:t>
             </w:r>
           </w:p>
         </w:tc>
@@ -18686,19 +16671,8 @@
             <w:vAlign w:val="top"/>
           </w:tcPr>
           <w:p>
-            <w:pPr>
-              <w:pageBreakBefore w:val="0"/>
-              <w:widowControl w:val="0"/>
-              <w:spacing w:line="240" w:lineRule="auto"/>
-              <w:rPr>
-                <w:sz w:val="36"/>
-                <w:szCs w:val="36"/>
-              </w:rPr>
-            </w:pPr>
-            <w:r>
-              <w:rPr>
-                <w:rtl w:val="0"/>
-              </w:rPr>
+            <w:r>
+              <w:t>It needs a wealthy state and high public trust - poor countries cannot afford it, and their people often demand harsher punishment.</w:t>
             </w:r>
           </w:p>
         </w:tc>
@@ -18713,19 +16687,8 @@
             <w:vAlign w:val="top"/>
           </w:tcPr>
           <w:p>
-            <w:pPr>
-              <w:pageBreakBefore w:val="0"/>
-              <w:widowControl w:val="0"/>
-              <w:spacing w:line="240" w:lineRule="auto"/>
-              <w:rPr>
-                <w:sz w:val="36"/>
-                <w:szCs w:val="36"/>
-              </w:rPr>
-            </w:pPr>
-            <w:r>
-              <w:rPr>
-                <w:rtl w:val="0"/>
-              </w:rPr>
+            <w:r>
+              <w:t>It needs a strong-authority political culture; international pressure makes it hard for democratic countries to copy.</w:t>
             </w:r>
           </w:p>
         </w:tc>
@@ -18926,16 +16889,8 @@
             <w:vAlign w:val="top"/>
           </w:tcPr>
           <w:p>
-            <w:pPr>
-              <w:pageBreakBefore w:val="0"/>
-              <w:widowControl w:val="0"/>
-              <w:spacing w:line="240" w:lineRule="auto"/>
-              <w:rPr/>
-            </w:pPr>
-            <w:r>
-              <w:rPr>
-                <w:rtl w:val="0"/>
-              </w:rPr>
+            <w:r>
+              <w:t>Giving every citizen (or every poor person) a regular, unconditional cash payment so they can survive and retrain when machines take their job.</w:t>
             </w:r>
           </w:p>
         </w:tc>
@@ -18983,16 +16938,8 @@
             <w:vAlign w:val="top"/>
           </w:tcPr>
           <w:p>
-            <w:pPr>
-              <w:pageBreakBefore w:val="0"/>
-              <w:widowControl w:val="0"/>
-              <w:spacing w:line="240" w:lineRule="auto"/>
-              <w:rPr/>
-            </w:pPr>
-            <w:r>
-              <w:rPr>
-                <w:rtl w:val="0"/>
-              </w:rPr>
+            <w:r>
+              <w:t>The charity GiveDirectly (with researchers), funding a 12-year experiment in the poorest neighbourhoods of Nairobi, Kenya - over 20,000 people receive monthly cash (about US$50). Finland also ran a 2-year national trial (2017-18).</w:t>
             </w:r>
           </w:p>
         </w:tc>
@@ -19040,16 +16987,8 @@
             <w:vAlign w:val="top"/>
           </w:tcPr>
           <w:p>
-            <w:pPr>
-              <w:pageBreakBefore w:val="0"/>
-              <w:widowControl w:val="0"/>
-              <w:spacing w:line="240" w:lineRule="auto"/>
-              <w:rPr/>
-            </w:pPr>
-            <w:r>
-              <w:rPr>
-                <w:rtl w:val="0"/>
-              </w:rPr>
+            <w:r>
+              <w:t>Kenya (the longest-running experiment), Finland, Stockton (USA).</w:t>
             </w:r>
           </w:p>
         </w:tc>
@@ -19111,16 +17050,8 @@
             <w:vAlign w:val="top"/>
           </w:tcPr>
           <w:p>
-            <w:pPr>
-              <w:pageBreakBefore w:val="0"/>
-              <w:widowControl w:val="0"/>
-              <w:spacing w:line="240" w:lineRule="auto"/>
-              <w:rPr/>
-            </w:pPr>
-            <w:r>
-              <w:rPr>
-                <w:rtl w:val="0"/>
-              </w:rPr>
+            <w:r>
+              <w:t>Puts money directly into the hands of the poorest - no bureaucracy; recipients use it to start small businesses or pay for training; known to boost wellbeing and entrepreneurship.</w:t>
             </w:r>
           </w:p>
         </w:tc>
@@ -19182,16 +17113,8 @@
             <w:vAlign w:val="top"/>
           </w:tcPr>
           <w:p>
-            <w:pPr>
-              <w:pageBreakBefore w:val="0"/>
-              <w:widowControl w:val="0"/>
-              <w:spacing w:line="240" w:lineRule="auto"/>
-              <w:rPr/>
-            </w:pPr>
-            <w:r>
-              <w:rPr>
-                <w:rtl w:val="0"/>
-              </w:rPr>
+            <w:r>
+              <w:t>Very expensive in the long term; Kenya's trial is funded by foreign donors; some politicians oppose 'free money'; it protects income but does not create the jobs themselves.</w:t>
             </w:r>
           </w:p>
         </w:tc>
@@ -19239,16 +17162,8 @@
             <w:vAlign w:val="top"/>
           </w:tcPr>
           <w:p>
-            <w:pPr>
-              <w:pageBreakBefore w:val="0"/>
-              <w:widowControl w:val="0"/>
-              <w:spacing w:line="240" w:lineRule="auto"/>
-              <w:rPr/>
-            </w:pPr>
-            <w:r>
-              <w:rPr>
-                <w:rtl w:val="0"/>
-              </w:rPr>
+            <w:r>
+              <w:t>No - it needs a country that can afford it and a system to pay people reliably; rich countries can, but the poorest countries cannot.</w:t>
             </w:r>
           </w:p>
         </w:tc>
@@ -19296,16 +17211,8 @@
             <w:vAlign w:val="top"/>
           </w:tcPr>
           <w:p>
-            <w:pPr>
-              <w:pageBreakBefore w:val="0"/>
-              <w:widowControl w:val="0"/>
-              <w:spacing w:line="240" w:lineRule="auto"/>
-              <w:rPr/>
-            </w:pPr>
-            <w:r>
-              <w:rPr>
-                <w:rtl w:val="0"/>
-              </w:rPr>
+            <w:r>
+              <w:t>Lack of government money, weak banking systems, and political opposition to giving people cash.</w:t>
             </w:r>
           </w:p>
         </w:tc>
@@ -19469,16 +17376,8 @@
             <w:vAlign w:val="top"/>
           </w:tcPr>
           <w:p>
-            <w:pPr>
-              <w:pageBreakBefore w:val="0"/>
-              <w:widowControl w:val="0"/>
-              <w:spacing w:line="240" w:lineRule="auto"/>
-              <w:rPr/>
-            </w:pPr>
-            <w:r>
-              <w:rPr>
-                <w:rtl w:val="0"/>
-              </w:rPr>
+            <w:r>
+              <w:t>Government programmes that train young people to earn online - freelancing, digital marketing, data entry, coding - through training hubs and online platforms.</w:t>
             </w:r>
           </w:p>
         </w:tc>
@@ -19526,16 +17425,8 @@
             <w:vAlign w:val="top"/>
           </w:tcPr>
           <w:p>
-            <w:pPr>
-              <w:pageBreakBefore w:val="0"/>
-              <w:widowControl w:val="0"/>
-              <w:spacing w:line="240" w:lineRule="auto"/>
-              <w:rPr/>
-            </w:pPr>
-            <w:r>
-              <w:rPr>
-                <w:rtl w:val="0"/>
-              </w:rPr>
+            <w:r>
+              <w:t>National governments, with UN agencies (ITU) and NGOs: Kenya's Ajira Digital programme and India's Skill India (PMKVY), which has trained millions.</w:t>
             </w:r>
           </w:p>
         </w:tc>
@@ -19583,16 +17474,8 @@
             <w:vAlign w:val="top"/>
           </w:tcPr>
           <w:p>
-            <w:pPr>
-              <w:pageBreakBefore w:val="0"/>
-              <w:widowControl w:val="0"/>
-              <w:spacing w:line="240" w:lineRule="auto"/>
-              <w:rPr/>
-            </w:pPr>
-            <w:r>
-              <w:rPr>
-                <w:rtl w:val="0"/>
-              </w:rPr>
+            <w:r>
+              <w:t>Kenya, India, Nigeria, Rwanda.</w:t>
             </w:r>
           </w:p>
         </w:tc>
@@ -19654,16 +17537,8 @@
             <w:vAlign w:val="top"/>
           </w:tcPr>
           <w:p>
-            <w:pPr>
-              <w:pageBreakBefore w:val="0"/>
-              <w:widowControl w:val="0"/>
-              <w:spacing w:line="240" w:lineRule="auto"/>
-              <w:rPr/>
-            </w:pPr>
-            <w:r>
-              <w:rPr>
-                <w:rtl w:val="0"/>
-              </w:rPr>
+            <w:r>
+              <w:t>Directly answers the problem - it equips people for the jobs the machines cannot do; cheap per person; income can start within months; it grows the tech sector.</w:t>
             </w:r>
           </w:p>
         </w:tc>
@@ -19725,16 +17600,8 @@
             <w:vAlign w:val="top"/>
           </w:tcPr>
           <w:p>
-            <w:pPr>
-              <w:pageBreakBefore w:val="0"/>
-              <w:widowControl w:val="0"/>
-              <w:spacing w:line="240" w:lineRule="auto"/>
-              <w:rPr/>
-            </w:pPr>
-            <w:r>
-              <w:rPr>
-                <w:rtl w:val="0"/>
-              </w:rPr>
+            <w:r>
+              <w:t>Only helps people who can learn digital skills - not today's 50-year-old factory workers; needs internet and electricity, which many villages lack; online freelance work can be low-paid and insecure.</w:t>
             </w:r>
           </w:p>
         </w:tc>
@@ -19782,16 +17649,8 @@
             <w:vAlign w:val="top"/>
           </w:tcPr>
           <w:p>
-            <w:pPr>
-              <w:pageBreakBefore w:val="0"/>
-              <w:widowControl w:val="0"/>
-              <w:spacing w:line="240" w:lineRule="auto"/>
-              <w:rPr/>
-            </w:pPr>
-            <w:r>
-              <w:rPr>
-                <w:rtl w:val="0"/>
-              </w:rPr>
+            <w:r>
+              <w:t>No - countries with poor internet, electricity and education levels cannot deliver it.</w:t>
             </w:r>
           </w:p>
         </w:tc>
@@ -19839,16 +17698,8 @@
             <w:vAlign w:val="top"/>
           </w:tcPr>
           <w:p>
-            <w:pPr>
-              <w:pageBreakBefore w:val="0"/>
-              <w:widowControl w:val="0"/>
-              <w:spacing w:line="240" w:lineRule="auto"/>
-              <w:rPr/>
-            </w:pPr>
-            <w:r>
-              <w:rPr>
-                <w:rtl w:val="0"/>
-              </w:rPr>
+            <w:r>
+              <w:t>No infrastructure, low literacy, and lack of devices (a phone or computer costs months of wages).</w:t>
             </w:r>
           </w:p>
         </w:tc>
@@ -20105,6 +17956,11 @@
           <w:rtl w:val="0"/>
         </w:rPr>
         <w:t xml:space="preserve">You can also conclude what you think should be done to solve the issue  in the future</w:t>
+      </w:r>
+    </w:p>
+    <w:p>
+      <w:r>
+        <w:t>I believe that in poorer countries, machines taking over jobs does more harm than good - at least in the short term. Poorer countries built their development on cheap labour - garment factories and call centres - and automation removes that ladder before they have built any other way up. The evidence supports this: up to 20 million manufacturing jobs lost to robots by 2030, with poorer regions hit almost twice as hard. However, I do not think the answer is to ban technology - that is impossible anyway. Instead, my research question points to action: governments and international organisations should pair new technology with reskilling (like Kenya's Ajira Digital) and safety nets (like Kenya's UBI experiment) so the transition does not crush the poorest. The harm is real, but it is a policy problem - and policy can be fixed.</w:t>
       </w:r>
     </w:p>
     <w:p>
@@ -22777,6 +20633,11 @@
       </w:r>
     </w:p>
     <w:p>
+      <w:r>
+        <w:t>I have learned how to research a global issue properly - telling facts from opinions and predictions, testing sources with the CRAAP criteria, and finding causes and consequences at local, national and global levels. I also learned how identity and values shape perspectives, and how different stakeholders from governments to individuals can take action.</w:t>
+      </w:r>
+    </w:p>
+    <w:p>
       <w:pPr>
         <w:pageBreakBefore w:val="0"/>
         <w:rPr/>
@@ -22789,6 +20650,11 @@
       </w:r>
     </w:p>
     <w:p>
+      <w:r>
+        <w:t>I enjoyed researching automation in poorer countries - it is a topic I already cared about as a tech user. I think I did well at evaluating sources and finding concrete evidence (like the 20-million-jobs figure) to back up my argument.</w:t>
+      </w:r>
+    </w:p>
+    <w:p>
       <w:pPr>
         <w:pageBreakBefore w:val="0"/>
         <w:rPr/>
@@ -22801,6 +20667,11 @@
       </w:r>
     </w:p>
     <w:p>
+      <w:r>
+        <w:t>Communication - I could have explained my points more clearly and used my evidence more in the presentation rather than just listing it. In critical thinking, I could have checked the bias of my sources earlier instead of assuming every source was trustworthy.</w:t>
+      </w:r>
+    </w:p>
+    <w:p>
       <w:pPr>
         <w:pageBreakBefore w:val="0"/>
         <w:rPr/>
@@ -22810,6 +20681,11 @@
           <w:rtl w:val="0"/>
         </w:rPr>
         <w:t xml:space="preserve">4. Can you use your slides or speech template for evidence of your growth in these areas ? </w:t>
+      </w:r>
+    </w:p>
+    <w:p>
+      <w:r>
+        <w:t>Yes - my early notes were just opinions, but my final slides structure the argument with evidence and courses of action, which shows I grew from opinion-based to evidence-based thinking.</w:t>
       </w:r>
     </w:p>
     <w:p>

</xml_diff>